<commit_message>
doc: atualizacao do artefato de sistemas distribuidos
</commit_message>
<xml_diff>
--- a/docs/ApêndiceI-ProjetodeSistemaDistribuído/ProjetodeSistemaDistribuído_v1.1.docx
+++ b/docs/ApêndiceI-ProjetodeSistemaDistribuído/ProjetodeSistemaDistribuído_v1.1.docx
@@ -334,8 +334,6 @@
               <w:tab w:val="right" w:leader="dot" w:pos="9072"/>
             </w:tabs>
           </w:pPr>
-          <w:bookmarkStart w:id="22" w:name="_GoBack"/>
-          <w:bookmarkEnd w:id="22"/>
           <w:r>
             <w:rPr>
               <w:bCs/>
@@ -364,7 +362,7 @@
             <w:rPr>
               <w:bCs/>
             </w:rPr>
-            <w:instrText xml:space="preserve"> HYPERLINK \l _Toc4512 </w:instrText>
+            <w:instrText xml:space="preserve"> HYPERLINK \l _Toc18930 </w:instrText>
           </w:r>
           <w:r>
             <w:rPr>
@@ -382,7 +380,7 @@
             <w:fldChar w:fldCharType="begin"/>
           </w:r>
           <w:r>
-            <w:instrText xml:space="preserve"> PAGEREF _Toc4512 \h </w:instrText>
+            <w:instrText xml:space="preserve"> PAGEREF _Toc18930 \h </w:instrText>
           </w:r>
           <w:r>
             <w:fldChar w:fldCharType="separate"/>
@@ -417,7 +415,7 @@
             <w:rPr>
               <w:bCs/>
             </w:rPr>
-            <w:instrText xml:space="preserve"> HYPERLINK \l _Toc7539 </w:instrText>
+            <w:instrText xml:space="preserve"> HYPERLINK \l _Toc19481 </w:instrText>
           </w:r>
           <w:r>
             <w:rPr>
@@ -438,7 +436,7 @@
             <w:fldChar w:fldCharType="begin"/>
           </w:r>
           <w:r>
-            <w:instrText xml:space="preserve"> PAGEREF _Toc7539 \h </w:instrText>
+            <w:instrText xml:space="preserve"> PAGEREF _Toc19481 \h </w:instrText>
           </w:r>
           <w:r>
             <w:fldChar w:fldCharType="separate"/>
@@ -473,7 +471,7 @@
             <w:rPr>
               <w:bCs/>
             </w:rPr>
-            <w:instrText xml:space="preserve"> HYPERLINK \l _Toc26054 </w:instrText>
+            <w:instrText xml:space="preserve"> HYPERLINK \l _Toc30514 </w:instrText>
           </w:r>
           <w:r>
             <w:rPr>
@@ -491,7 +489,7 @@
             <w:fldChar w:fldCharType="begin"/>
           </w:r>
           <w:r>
-            <w:instrText xml:space="preserve"> PAGEREF _Toc26054 \h </w:instrText>
+            <w:instrText xml:space="preserve"> PAGEREF _Toc30514 \h </w:instrText>
           </w:r>
           <w:r>
             <w:fldChar w:fldCharType="separate"/>
@@ -526,7 +524,7 @@
             <w:rPr>
               <w:bCs/>
             </w:rPr>
-            <w:instrText xml:space="preserve"> HYPERLINK \l _Toc7000 </w:instrText>
+            <w:instrText xml:space="preserve"> HYPERLINK \l _Toc25195 </w:instrText>
           </w:r>
           <w:r>
             <w:rPr>
@@ -544,7 +542,7 @@
             <w:fldChar w:fldCharType="begin"/>
           </w:r>
           <w:r>
-            <w:instrText xml:space="preserve"> PAGEREF _Toc7000 \h </w:instrText>
+            <w:instrText xml:space="preserve"> PAGEREF _Toc25195 \h </w:instrText>
           </w:r>
           <w:r>
             <w:fldChar w:fldCharType="separate"/>
@@ -579,7 +577,7 @@
             <w:rPr>
               <w:bCs/>
             </w:rPr>
-            <w:instrText xml:space="preserve"> HYPERLINK \l _Toc6445 </w:instrText>
+            <w:instrText xml:space="preserve"> HYPERLINK \l _Toc6052 </w:instrText>
           </w:r>
           <w:r>
             <w:rPr>
@@ -597,7 +595,7 @@
             <w:fldChar w:fldCharType="begin"/>
           </w:r>
           <w:r>
-            <w:instrText xml:space="preserve"> PAGEREF _Toc6445 \h </w:instrText>
+            <w:instrText xml:space="preserve"> PAGEREF _Toc6052 \h </w:instrText>
           </w:r>
           <w:r>
             <w:fldChar w:fldCharType="separate"/>
@@ -632,7 +630,7 @@
             <w:rPr>
               <w:bCs/>
             </w:rPr>
-            <w:instrText xml:space="preserve"> HYPERLINK \l _Toc9601 </w:instrText>
+            <w:instrText xml:space="preserve"> HYPERLINK \l _Toc7680 </w:instrText>
           </w:r>
           <w:r>
             <w:rPr>
@@ -650,7 +648,7 @@
             <w:fldChar w:fldCharType="begin"/>
           </w:r>
           <w:r>
-            <w:instrText xml:space="preserve"> PAGEREF _Toc9601 \h </w:instrText>
+            <w:instrText xml:space="preserve"> PAGEREF _Toc7680 \h </w:instrText>
           </w:r>
           <w:r>
             <w:fldChar w:fldCharType="separate"/>
@@ -685,7 +683,7 @@
             <w:rPr>
               <w:bCs/>
             </w:rPr>
-            <w:instrText xml:space="preserve"> HYPERLINK \l _Toc2748 </w:instrText>
+            <w:instrText xml:space="preserve"> HYPERLINK \l _Toc14534 </w:instrText>
           </w:r>
           <w:r>
             <w:rPr>
@@ -703,7 +701,7 @@
             <w:fldChar w:fldCharType="begin"/>
           </w:r>
           <w:r>
-            <w:instrText xml:space="preserve"> PAGEREF _Toc2748 \h </w:instrText>
+            <w:instrText xml:space="preserve"> PAGEREF _Toc14534 \h </w:instrText>
           </w:r>
           <w:r>
             <w:fldChar w:fldCharType="separate"/>
@@ -738,7 +736,7 @@
             <w:rPr>
               <w:bCs/>
             </w:rPr>
-            <w:instrText xml:space="preserve"> HYPERLINK \l _Toc10583 </w:instrText>
+            <w:instrText xml:space="preserve"> HYPERLINK \l _Toc16150 </w:instrText>
           </w:r>
           <w:r>
             <w:rPr>
@@ -756,13 +754,13 @@
             <w:fldChar w:fldCharType="begin"/>
           </w:r>
           <w:r>
-            <w:instrText xml:space="preserve"> PAGEREF _Toc10583 \h </w:instrText>
+            <w:instrText xml:space="preserve"> PAGEREF _Toc16150 \h </w:instrText>
           </w:r>
           <w:r>
             <w:fldChar w:fldCharType="separate"/>
           </w:r>
           <w:r>
-            <w:t>5</w:t>
+            <w:t>6</w:t>
           </w:r>
           <w:r>
             <w:fldChar w:fldCharType="end"/>
@@ -791,7 +789,7 @@
             <w:rPr>
               <w:bCs/>
             </w:rPr>
-            <w:instrText xml:space="preserve"> HYPERLINK \l _Toc23504 </w:instrText>
+            <w:instrText xml:space="preserve"> HYPERLINK \l _Toc18354 </w:instrText>
           </w:r>
           <w:r>
             <w:rPr>
@@ -809,7 +807,7 @@
             <w:fldChar w:fldCharType="begin"/>
           </w:r>
           <w:r>
-            <w:instrText xml:space="preserve"> PAGEREF _Toc23504 \h </w:instrText>
+            <w:instrText xml:space="preserve"> PAGEREF _Toc18354 \h </w:instrText>
           </w:r>
           <w:r>
             <w:fldChar w:fldCharType="separate"/>
@@ -844,7 +842,7 @@
             <w:rPr>
               <w:bCs/>
             </w:rPr>
-            <w:instrText xml:space="preserve"> HYPERLINK \l _Toc28149 </w:instrText>
+            <w:instrText xml:space="preserve"> HYPERLINK \l _Toc15592 </w:instrText>
           </w:r>
           <w:r>
             <w:rPr>
@@ -865,7 +863,7 @@
             <w:fldChar w:fldCharType="begin"/>
           </w:r>
           <w:r>
-            <w:instrText xml:space="preserve"> PAGEREF _Toc28149 \h </w:instrText>
+            <w:instrText xml:space="preserve"> PAGEREF _Toc15592 \h </w:instrText>
           </w:r>
           <w:r>
             <w:fldChar w:fldCharType="separate"/>
@@ -900,7 +898,7 @@
             <w:rPr>
               <w:bCs/>
             </w:rPr>
-            <w:instrText xml:space="preserve"> HYPERLINK \l _Toc32133 </w:instrText>
+            <w:instrText xml:space="preserve"> HYPERLINK \l _Toc19223 </w:instrText>
           </w:r>
           <w:r>
             <w:rPr>
@@ -918,13 +916,13 @@
             <w:fldChar w:fldCharType="begin"/>
           </w:r>
           <w:r>
-            <w:instrText xml:space="preserve"> PAGEREF _Toc32133 \h </w:instrText>
+            <w:instrText xml:space="preserve"> PAGEREF _Toc19223 \h </w:instrText>
           </w:r>
           <w:r>
             <w:fldChar w:fldCharType="separate"/>
           </w:r>
           <w:r>
-            <w:t>8</w:t>
+            <w:t>9</w:t>
           </w:r>
           <w:r>
             <w:fldChar w:fldCharType="end"/>
@@ -969,7 +967,7 @@
       <w:bookmarkStart w:id="1" w:name="_Toc14345934"/>
       <w:bookmarkStart w:id="2" w:name="_Toc507747267"/>
       <w:bookmarkStart w:id="3" w:name="_Toc46909575"/>
-      <w:bookmarkStart w:id="4" w:name="_Toc4512"/>
+      <w:bookmarkStart w:id="4" w:name="_Toc18930"/>
       <w:r>
         <w:t xml:space="preserve">1 </w:t>
       </w:r>
@@ -983,13 +981,20 @@
     </w:p>
     <w:p>
       <w:bookmarkStart w:id="5" w:name="_Toc507747268"/>
-      <w:bookmarkStart w:id="6" w:name="_Toc14345935"/>
-      <w:bookmarkStart w:id="7" w:name="_Toc46909576"/>
-      <w:r>
-        <w:rPr>
+      <w:bookmarkStart w:id="6" w:name="_Toc46909576"/>
+      <w:bookmarkStart w:id="7" w:name="_Toc14345935"/>
+      <w:r>
+        <w:rPr>
+          <w:rFonts w:hint="default"/>
           <w:bCs/>
         </w:rPr>
-        <w:t>Um sistema distribuído pode ser compreendido como um conjunto de computadores independentes, interconectados por uma rede de comunicação, que se apresentam aos seus usuários como um único sistema coerente (Tanenbaum; Steen, 2007). Essa definição é reforçada por Silberschatz, Galvin e Gagne (2008), que descrevem sistemas distribuídos como um conjunto de processadores frouxamente acoplados, que não compartilham memória ou relógio, mas que cooperam entre si por meio de troca de mensagens.</w:t>
+        <w:t>Um sistema distribuído pode ser compreendido como um conjunto de computadores independentes, interconectados por uma rede de comunicação, que se apresentam aos seus usuários como um único sistema coerente (TANENBAUM; STEEN, 2007). Essa definição é reforçada por Silberschatz, Galvin e Gagne (2008), que descrevem sistemas distribuídos como um conjunto de processadores frouxamente acoplados, que não compartilham memória ou relógio, mas que cooperam entre si por meio de troca de mensagens. Nesse contexto, o Projeto SAGE foi desenvolvido como um exemplo prático de sistema distribuído, integrando diferentes dispositivos e serviços para oferecer monitoramento em tempo real. A arquitetura proposta pode ser visualizada na Figura 1, que apresenta a disposição dos principais componentes e suas interações</w:t>
+      </w:r>
+      <w:r>
+        <w:rPr>
+          <w:bCs/>
+        </w:rPr>
+        <w:t>.</w:t>
       </w:r>
     </w:p>
     <w:p>
@@ -1001,7 +1006,7 @@
       <w:pPr>
         <w:pStyle w:val="3"/>
       </w:pPr>
-      <w:bookmarkStart w:id="8" w:name="_Toc7539"/>
+      <w:bookmarkStart w:id="8" w:name="_Toc19481"/>
       <w:r>
         <w:rPr>
           <w:caps w:val="0"/>
@@ -1206,7 +1211,7 @@
       <w:pPr>
         <w:pStyle w:val="4"/>
       </w:pPr>
-      <w:bookmarkStart w:id="9" w:name="_Toc26054"/>
+      <w:bookmarkStart w:id="9" w:name="_Toc30514"/>
       <w:r>
         <w:t>1.1.1 Heterogeneidade</w:t>
       </w:r>
@@ -1232,7 +1237,7 @@
       <w:pPr>
         <w:pStyle w:val="4"/>
       </w:pPr>
-      <w:bookmarkStart w:id="10" w:name="_Toc7000"/>
+      <w:bookmarkStart w:id="10" w:name="_Toc25195"/>
       <w:r>
         <w:t>1.1.2 Escalabilidade</w:t>
       </w:r>
@@ -1258,7 +1263,7 @@
       <w:pPr>
         <w:pStyle w:val="4"/>
       </w:pPr>
-      <w:bookmarkStart w:id="11" w:name="_Toc6445"/>
+      <w:bookmarkStart w:id="11" w:name="_Toc6052"/>
       <w:r>
         <w:t>1.1.3 Abertura</w:t>
       </w:r>
@@ -1293,7 +1298,7 @@
       <w:pPr>
         <w:pStyle w:val="4"/>
       </w:pPr>
-      <w:bookmarkStart w:id="13" w:name="_Toc9601"/>
+      <w:bookmarkStart w:id="13" w:name="_Toc7680"/>
       <w:r>
         <w:t>1.1.4 Segurança</w:t>
       </w:r>
@@ -1319,7 +1324,7 @@
       <w:pPr>
         <w:pStyle w:val="4"/>
       </w:pPr>
-      <w:bookmarkStart w:id="14" w:name="_Toc2748"/>
+      <w:bookmarkStart w:id="14" w:name="_Toc14534"/>
       <w:r>
         <w:t>1.1.5 Manuseio de Falhas</w:t>
       </w:r>
@@ -1345,7 +1350,7 @@
       <w:pPr>
         <w:pStyle w:val="4"/>
       </w:pPr>
-      <w:bookmarkStart w:id="15" w:name="_Toc10583"/>
+      <w:bookmarkStart w:id="15" w:name="_Toc16150"/>
       <w:r>
         <w:t>1.1.6 Concorrência</w:t>
       </w:r>
@@ -1371,7 +1376,7 @@
       <w:pPr>
         <w:pStyle w:val="4"/>
       </w:pPr>
-      <w:bookmarkStart w:id="16" w:name="_Toc23504"/>
+      <w:bookmarkStart w:id="16" w:name="_Toc18354"/>
       <w:r>
         <w:t>1.1.7 Transparência</w:t>
       </w:r>
@@ -1406,10 +1411,10 @@
           <w:caps w:val="0"/>
         </w:rPr>
       </w:pPr>
-      <w:bookmarkStart w:id="17" w:name="_Toc507747269"/>
-      <w:bookmarkStart w:id="18" w:name="_Toc46909577"/>
-      <w:bookmarkStart w:id="19" w:name="_Toc14345936"/>
-      <w:bookmarkStart w:id="20" w:name="_Toc28149"/>
+      <w:bookmarkStart w:id="17" w:name="_Toc46909577"/>
+      <w:bookmarkStart w:id="18" w:name="_Toc14345936"/>
+      <w:bookmarkStart w:id="19" w:name="_Toc507747269"/>
+      <w:bookmarkStart w:id="20" w:name="_Toc15592"/>
       <w:r>
         <w:rPr>
           <w:caps w:val="0"/>
@@ -1513,42 +1518,6 @@
         </w:rPr>
         <w:t>A seguir o diagrama de sistemas distribuídos do projeto.</w:t>
       </w:r>
-    </w:p>
-    <w:p>
-      <w:pPr>
-        <w:pStyle w:val="34"/>
-        <w:ind w:left="0"/>
-        <w:rPr>
-          <w:color w:val="0070C0"/>
-        </w:rPr>
-      </w:pPr>
-    </w:p>
-    <w:p>
-      <w:pPr>
-        <w:pStyle w:val="34"/>
-        <w:ind w:left="0"/>
-        <w:rPr>
-          <w:color w:val="0070C0"/>
-        </w:rPr>
-      </w:pPr>
-    </w:p>
-    <w:p>
-      <w:pPr>
-        <w:pStyle w:val="34"/>
-        <w:ind w:left="0"/>
-        <w:rPr>
-          <w:color w:val="0070C0"/>
-        </w:rPr>
-      </w:pPr>
-    </w:p>
-    <w:p>
-      <w:pPr>
-        <w:pStyle w:val="34"/>
-        <w:ind w:left="0"/>
-        <w:rPr>
-          <w:color w:val="0070C0"/>
-        </w:rPr>
-      </w:pPr>
     </w:p>
     <w:p>
       <w:pPr>
@@ -2597,7 +2566,7 @@
           </mc:Choice>
           <mc:Fallback>
             <w:pict>
-              <v:shape id="_x0000_s1026" o:spid="_x0000_s1026" o:spt="202" type="#_x0000_t202" style="position:absolute;left:0pt;margin-left:242.55pt;margin-top:8.1pt;height:52.75pt;width:115.95pt;z-index:251668480;mso-width-relative:page;mso-height-relative:page;" fillcolor="#FFFFFF [3201]" filled="t" stroked="t" coordsize="21600,21600" o:gfxdata="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">
+              <v:shape id="_x0000_s1026" o:spid="_x0000_s1026" o:spt="202" type="#_x0000_t202" style="position:absolute;left:0pt;margin-left:242.55pt;margin-top:8.1pt;height:52.75pt;width:115.95pt;z-index:251668480;mso-width-relative:page;mso-height-relative:page;" fillcolor="#FFFFFF [3201]" filled="t" stroked="t" coordsize="21600,21600" o:gfxdata="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">
                 <v:fill on="t" focussize="0,0"/>
                 <v:stroke weight="0.5pt" color="#FFFFFF [3212]" joinstyle="round"/>
                 <v:imagedata o:title=""/>
@@ -4129,6 +4098,8 @@
           <w:color w:val="0070C0"/>
         </w:rPr>
       </w:pPr>
+      <w:bookmarkStart w:id="22" w:name="_GoBack"/>
+      <w:bookmarkEnd w:id="22"/>
       <w:r>
         <w:rPr>
           <w:sz w:val="22"/>
@@ -4142,10 +4113,10 @@
                   <wp:posOffset>159385</wp:posOffset>
                 </wp:positionH>
                 <wp:positionV relativeFrom="paragraph">
-                  <wp:posOffset>14605</wp:posOffset>
+                  <wp:posOffset>123190</wp:posOffset>
                 </wp:positionV>
-                <wp:extent cx="1456690" cy="543560"/>
-                <wp:effectExtent l="4445" t="4445" r="17145" b="15875"/>
+                <wp:extent cx="1826260" cy="434975"/>
+                <wp:effectExtent l="4445" t="4445" r="13335" b="17780"/>
                 <wp:wrapNone/>
                 <wp:docPr id="29" name="Caixa de Texto 29"/>
                 <wp:cNvGraphicFramePr/>
@@ -4156,7 +4127,7 @@
                       <wps:spPr>
                         <a:xfrm>
                           <a:off x="0" y="0"/>
-                          <a:ext cx="1456690" cy="543560"/>
+                          <a:ext cx="1826260" cy="434975"/>
                         </a:xfrm>
                         <a:prstGeom prst="rect">
                           <a:avLst/>
@@ -4190,34 +4161,6 @@
                             <w:pPr>
                               <w:spacing w:line="240" w:lineRule="auto"/>
                               <w:rPr>
-                                <w:i/>
-                                <w:sz w:val="18"/>
-                                <w:szCs w:val="18"/>
-                                <w:lang w:val="en-GB"/>
-                              </w:rPr>
-                            </w:pPr>
-                            <w:r>
-                              <w:rPr>
-                                <w:sz w:val="18"/>
-                                <w:szCs w:val="18"/>
-                                <w:lang w:val="en-GB"/>
-                              </w:rPr>
-                              <w:t xml:space="preserve">P2 - Servidor </w:t>
-                            </w:r>
-                            <w:r>
-                              <w:rPr>
-                                <w:i/>
-                                <w:sz w:val="18"/>
-                                <w:szCs w:val="18"/>
-                                <w:lang w:val="en-GB"/>
-                              </w:rPr>
-                              <w:t>Front-End</w:t>
-                            </w:r>
-                          </w:p>
-                          <w:p>
-                            <w:pPr>
-                              <w:spacing w:line="240" w:lineRule="auto"/>
-                              <w:rPr>
                                 <w:rFonts w:hint="default"/>
                                 <w:sz w:val="18"/>
                                 <w:szCs w:val="18"/>
@@ -4230,16 +4173,43 @@
                                 <w:szCs w:val="18"/>
                                 <w:lang w:val="en-GB"/>
                               </w:rPr>
-                              <w:t>SAGE -</w:t>
+                              <w:t>P2 -</w:t>
                             </w:r>
                             <w:r>
                               <w:rPr>
                                 <w:rFonts w:hint="default"/>
+                                <w:i/>
                                 <w:sz w:val="18"/>
                                 <w:szCs w:val="18"/>
                                 <w:lang w:val="pt-BR"/>
                               </w:rPr>
-                              <w:t xml:space="preserve"> Node.js</w:t>
+                              <w:t xml:space="preserve"> </w:t>
+                            </w:r>
+                            <w:r>
+                              <w:rPr>
+                                <w:sz w:val="18"/>
+                                <w:szCs w:val="18"/>
+                                <w:lang w:val="en-GB"/>
+                              </w:rPr>
+                              <w:t xml:space="preserve">Servidor </w:t>
+                            </w:r>
+                            <w:r>
+                              <w:rPr>
+                                <w:i/>
+                                <w:iCs/>
+                                <w:sz w:val="18"/>
+                                <w:szCs w:val="18"/>
+                                <w:lang w:val="en-GB"/>
+                              </w:rPr>
+                              <w:t>Front-End</w:t>
+                            </w:r>
+                            <w:r>
+                              <w:rPr>
+                                <w:sz w:val="18"/>
+                                <w:szCs w:val="18"/>
+                                <w:lang w:val="en-GB"/>
+                              </w:rPr>
+                              <w:t xml:space="preserve"> (Node.js / SAGE WEB)</w:t>
                             </w:r>
                           </w:p>
                         </w:txbxContent>
@@ -4255,41 +4225,13 @@
           </mc:Choice>
           <mc:Fallback>
             <w:pict>
-              <v:shape id="_x0000_s1026" o:spid="_x0000_s1026" o:spt="202" type="#_x0000_t202" style="position:absolute;left:0pt;margin-left:12.55pt;margin-top:1.15pt;height:42.8pt;width:114.7pt;z-index:251667456;mso-width-relative:page;mso-height-relative:page;" fillcolor="#FFFFFF [3201]" filled="t" stroked="t" coordsize="21600,21600" o:gfxdata="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">
+              <v:shape id="_x0000_s1026" o:spid="_x0000_s1026" o:spt="202" type="#_x0000_t202" style="position:absolute;left:0pt;margin-left:12.55pt;margin-top:9.7pt;height:34.25pt;width:143.8pt;z-index:251667456;mso-width-relative:page;mso-height-relative:page;" fillcolor="#FFFFFF [3201]" filled="t" stroked="t" coordsize="21600,21600" o:gfxdata="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">
                 <v:fill on="t" focussize="0,0"/>
                 <v:stroke weight="0.5pt" color="#FFFFFF [3212]" joinstyle="round"/>
                 <v:imagedata o:title=""/>
                 <o:lock v:ext="edit" aspectratio="f"/>
                 <v:textbox>
                   <w:txbxContent>
-                    <w:p>
-                      <w:pPr>
-                        <w:spacing w:line="240" w:lineRule="auto"/>
-                        <w:rPr>
-                          <w:i/>
-                          <w:sz w:val="18"/>
-                          <w:szCs w:val="18"/>
-                          <w:lang w:val="en-GB"/>
-                        </w:rPr>
-                      </w:pPr>
-                      <w:r>
-                        <w:rPr>
-                          <w:sz w:val="18"/>
-                          <w:szCs w:val="18"/>
-                          <w:lang w:val="en-GB"/>
-                        </w:rPr>
-                        <w:t xml:space="preserve">P2 - Servidor </w:t>
-                      </w:r>
-                      <w:r>
-                        <w:rPr>
-                          <w:i/>
-                          <w:sz w:val="18"/>
-                          <w:szCs w:val="18"/>
-                          <w:lang w:val="en-GB"/>
-                        </w:rPr>
-                        <w:t>Front-End</w:t>
-                      </w:r>
-                    </w:p>
                     <w:p>
                       <w:pPr>
                         <w:spacing w:line="240" w:lineRule="auto"/>
@@ -4306,16 +4248,43 @@
                           <w:szCs w:val="18"/>
                           <w:lang w:val="en-GB"/>
                         </w:rPr>
-                        <w:t>SAGE -</w:t>
+                        <w:t>P2 -</w:t>
                       </w:r>
                       <w:r>
                         <w:rPr>
                           <w:rFonts w:hint="default"/>
+                          <w:i/>
                           <w:sz w:val="18"/>
                           <w:szCs w:val="18"/>
                           <w:lang w:val="pt-BR"/>
                         </w:rPr>
-                        <w:t xml:space="preserve"> Node.js</w:t>
+                        <w:t xml:space="preserve"> </w:t>
+                      </w:r>
+                      <w:r>
+                        <w:rPr>
+                          <w:sz w:val="18"/>
+                          <w:szCs w:val="18"/>
+                          <w:lang w:val="en-GB"/>
+                        </w:rPr>
+                        <w:t xml:space="preserve">Servidor </w:t>
+                      </w:r>
+                      <w:r>
+                        <w:rPr>
+                          <w:i/>
+                          <w:iCs/>
+                          <w:sz w:val="18"/>
+                          <w:szCs w:val="18"/>
+                          <w:lang w:val="en-GB"/>
+                        </w:rPr>
+                        <w:t>Front-End</w:t>
+                      </w:r>
+                      <w:r>
+                        <w:rPr>
+                          <w:sz w:val="18"/>
+                          <w:szCs w:val="18"/>
+                          <w:lang w:val="en-GB"/>
+                        </w:rPr>
+                        <w:t xml:space="preserve"> (Node.js / SAGE WEB)</w:t>
                       </w:r>
                     </w:p>
                   </w:txbxContent>
@@ -5733,7 +5702,23 @@
                                 <w:sz w:val="18"/>
                                 <w:szCs w:val="18"/>
                               </w:rPr>
-                              <w:t>P1 - Navegador cliente Google Chome</w:t>
+                              <w:t>P1 - Navegador cliente Google Ch</w:t>
+                            </w:r>
+                            <w:r>
+                              <w:rPr>
+                                <w:rFonts w:hint="default"/>
+                                <w:sz w:val="18"/>
+                                <w:szCs w:val="18"/>
+                                <w:lang w:val="pt-BR"/>
+                              </w:rPr>
+                              <w:t>r</w:t>
+                            </w:r>
+                            <w:r>
+                              <w:rPr>
+                                <w:sz w:val="18"/>
+                                <w:szCs w:val="18"/>
+                              </w:rPr>
+                              <w:t>ome</w:t>
                             </w:r>
                           </w:p>
                         </w:txbxContent>
@@ -5768,7 +5753,23 @@
                           <w:sz w:val="18"/>
                           <w:szCs w:val="18"/>
                         </w:rPr>
-                        <w:t>P1 - Navegador cliente Google Chome</w:t>
+                        <w:t>P1 - Navegador cliente Google Ch</w:t>
+                      </w:r>
+                      <w:r>
+                        <w:rPr>
+                          <w:rFonts w:hint="default"/>
+                          <w:sz w:val="18"/>
+                          <w:szCs w:val="18"/>
+                          <w:lang w:val="pt-BR"/>
+                        </w:rPr>
+                        <w:t>r</w:t>
+                      </w:r>
+                      <w:r>
+                        <w:rPr>
+                          <w:sz w:val="18"/>
+                          <w:szCs w:val="18"/>
+                        </w:rPr>
+                        <w:t>ome</w:t>
                       </w:r>
                     </w:p>
                   </w:txbxContent>
@@ -6509,36 +6510,100 @@
           <w:bCs/>
           <w:szCs w:val="24"/>
         </w:rPr>
-        <w:t>O Sage é composto por uma arquitetura distribuída que integra dispositivos locais e aplicações móveis para oferecer monitoramento e resposta em tempo real a eventos capturados por uma central de alarme.</w:t>
-      </w:r>
-    </w:p>
-    <w:p>
-      <w:pPr>
-        <w:rPr>
+        <w:t xml:space="preserve">O </w:t>
+      </w:r>
+      <w:r>
+        <w:rPr>
+          <w:rFonts w:hint="default"/>
           <w:bCs/>
           <w:szCs w:val="24"/>
-        </w:rPr>
-      </w:pPr>
+          <w:lang w:val="pt-BR"/>
+        </w:rPr>
+        <w:t xml:space="preserve">SAGE </w:t>
+      </w:r>
       <w:r>
         <w:rPr>
           <w:bCs/>
           <w:szCs w:val="24"/>
         </w:rPr>
-        <w:t>A estrutura inicia-se com a central de alarmes, que se comunica com o servidor local por meio de conexão Wi-Fi via socket TCP/IP. Esse servidor trata os dados emitidos pela central de forma digital.</w:t>
-      </w:r>
-    </w:p>
-    <w:p>
-      <w:pPr>
-        <w:rPr>
+        <w:t>é composto por uma arquitetura distribuída que integra dispositivos locais</w:t>
+      </w:r>
+      <w:r>
+        <w:rPr>
+          <w:rFonts w:hint="default"/>
           <w:bCs/>
           <w:szCs w:val="24"/>
-        </w:rPr>
-      </w:pPr>
+          <w:lang w:val="pt-BR"/>
+        </w:rPr>
+        <w:t xml:space="preserve"> </w:t>
+      </w:r>
       <w:r>
         <w:rPr>
           <w:bCs/>
           <w:szCs w:val="24"/>
         </w:rPr>
+        <w:t>para oferecer monitoramento e resposta em tempo real a eventos capturados por uma central de alarme</w:t>
+      </w:r>
+      <w:r>
+        <w:rPr>
+          <w:rFonts w:hint="default"/>
+          <w:bCs/>
+          <w:szCs w:val="24"/>
+          <w:lang w:val="pt-BR"/>
+        </w:rPr>
+        <w:t>s</w:t>
+      </w:r>
+      <w:r>
+        <w:rPr>
+          <w:bCs/>
+          <w:szCs w:val="24"/>
+        </w:rPr>
+        <w:t>.</w:t>
+      </w:r>
+    </w:p>
+    <w:p>
+      <w:pPr>
+        <w:rPr>
+          <w:bCs/>
+          <w:szCs w:val="24"/>
+        </w:rPr>
+      </w:pPr>
+      <w:r>
+        <w:rPr>
+          <w:bCs/>
+          <w:szCs w:val="24"/>
+        </w:rPr>
+        <w:t xml:space="preserve">A estrutura inicia-se com a central de alarmes, que se comunica com o servidor local por meio de conexão Wi-Fi via </w:t>
+      </w:r>
+      <w:r>
+        <w:rPr>
+          <w:bCs/>
+          <w:i/>
+          <w:iCs/>
+          <w:szCs w:val="24"/>
+        </w:rPr>
+        <w:t>socket</w:t>
+      </w:r>
+      <w:r>
+        <w:rPr>
+          <w:bCs/>
+          <w:szCs w:val="24"/>
+        </w:rPr>
+        <w:t xml:space="preserve"> TCP/IP. Esse servidor trata os dados emitidos pela central de forma digital.</w:t>
+      </w:r>
+    </w:p>
+    <w:p>
+      <w:pPr>
+        <w:rPr>
+          <w:bCs/>
+          <w:szCs w:val="24"/>
+        </w:rPr>
+      </w:pPr>
+      <w:r>
+        <w:rPr>
+          <w:bCs/>
+          <w:szCs w:val="24"/>
+        </w:rPr>
         <w:t>Essa arquitetura oferece os seguintes benefícios: conectividade local eficiente, com comunicação rápida e segura com o servidor; e escalabilidade e modularidade, permitindo a expansão futura do sistema sem reestruturação completa. A adoção dessa arquitetura oferece uma solução moderna, segura e resiliente para sistemas de monitoramento.</w:t>
       </w:r>
     </w:p>
@@ -6557,7 +6622,7 @@
         </w:rPr>
         <w:br w:type="page"/>
       </w:r>
-      <w:bookmarkStart w:id="21" w:name="_Toc32133"/>
+      <w:bookmarkStart w:id="21" w:name="_Toc19223"/>
       <w:r>
         <w:t>REFERÊNCIAS</w:t>
       </w:r>
@@ -6818,7 +6883,7 @@
   <w:docDefaults>
     <w:rPrDefault>
       <w:rPr>
-        <w:rFonts w:ascii="Times New Roman" w:hAnsi="Times New Roman" w:eastAsia="Times New Roman" w:cs="Times New Roman"/>
+        <w:rFonts w:ascii="Times New Roman" w:hAnsi="Times New Roman" w:eastAsia="SimSun" w:cs="Times New Roman"/>
       </w:rPr>
     </w:rPrDefault>
     <w:pPrDefault/>
@@ -7341,6 +7406,7 @@
   </w:style>
   <w:style w:type="paragraph" w:customStyle="1" w:styleId="27">
     <w:name w:val="Default"/>
+    <w:qFormat/>
     <w:uiPriority w:val="0"/>
     <w:pPr>
       <w:autoSpaceDE w:val="0"/>
@@ -7374,6 +7440,7 @@
     <w:name w:val="CAPA"/>
     <w:basedOn w:val="1"/>
     <w:autoRedefine/>
+    <w:qFormat/>
     <w:uiPriority w:val="0"/>
     <w:pPr>
       <w:spacing w:line="240" w:lineRule="auto"/>

</xml_diff>

<commit_message>
doc: correcoes no artefato de sistemas distribuidos
</commit_message>
<xml_diff>
--- a/docs/ApêndiceI-ProjetodeSistemaDistribuído/ProjetodeSistemaDistribuído_v1.1.docx
+++ b/docs/ApêndiceI-ProjetodeSistemaDistribuído/ProjetodeSistemaDistribuído_v1.1.docx
@@ -362,7 +362,7 @@
             <w:rPr>
               <w:bCs/>
             </w:rPr>
-            <w:instrText xml:space="preserve"> HYPERLINK \l _Toc18930 </w:instrText>
+            <w:instrText xml:space="preserve"> HYPERLINK \l _Toc27094 </w:instrText>
           </w:r>
           <w:r>
             <w:rPr>
@@ -380,7 +380,7 @@
             <w:fldChar w:fldCharType="begin"/>
           </w:r>
           <w:r>
-            <w:instrText xml:space="preserve"> PAGEREF _Toc18930 \h </w:instrText>
+            <w:instrText xml:space="preserve"> PAGEREF _Toc27094 \h </w:instrText>
           </w:r>
           <w:r>
             <w:fldChar w:fldCharType="separate"/>
@@ -415,7 +415,7 @@
             <w:rPr>
               <w:bCs/>
             </w:rPr>
-            <w:instrText xml:space="preserve"> HYPERLINK \l _Toc19481 </w:instrText>
+            <w:instrText xml:space="preserve"> HYPERLINK \l _Toc18925 </w:instrText>
           </w:r>
           <w:r>
             <w:rPr>
@@ -436,7 +436,7 @@
             <w:fldChar w:fldCharType="begin"/>
           </w:r>
           <w:r>
-            <w:instrText xml:space="preserve"> PAGEREF _Toc19481 \h </w:instrText>
+            <w:instrText xml:space="preserve"> PAGEREF _Toc18925 \h </w:instrText>
           </w:r>
           <w:r>
             <w:fldChar w:fldCharType="separate"/>
@@ -471,7 +471,7 @@
             <w:rPr>
               <w:bCs/>
             </w:rPr>
-            <w:instrText xml:space="preserve"> HYPERLINK \l _Toc30514 </w:instrText>
+            <w:instrText xml:space="preserve"> HYPERLINK \l _Toc32638 </w:instrText>
           </w:r>
           <w:r>
             <w:rPr>
@@ -480,7 +480,17 @@
             <w:fldChar w:fldCharType="separate"/>
           </w:r>
           <w:r>
-            <w:t>1.1.1 Heterogeneidade</w:t>
+            <w:t>1.1.</w:t>
+          </w:r>
+          <w:r>
+            <w:rPr>
+              <w:rFonts w:hint="default"/>
+              <w:lang w:val="pt-BR"/>
+            </w:rPr>
+            <w:t>1</w:t>
+          </w:r>
+          <w:r>
+            <w:t xml:space="preserve"> Abertura</w:t>
           </w:r>
           <w:r>
             <w:tab/>
@@ -489,7 +499,7 @@
             <w:fldChar w:fldCharType="begin"/>
           </w:r>
           <w:r>
-            <w:instrText xml:space="preserve"> PAGEREF _Toc30514 \h </w:instrText>
+            <w:instrText xml:space="preserve"> PAGEREF _Toc32638 \h </w:instrText>
           </w:r>
           <w:r>
             <w:fldChar w:fldCharType="separate"/>
@@ -524,7 +534,7 @@
             <w:rPr>
               <w:bCs/>
             </w:rPr>
-            <w:instrText xml:space="preserve"> HYPERLINK \l _Toc25195 </w:instrText>
+            <w:instrText xml:space="preserve"> HYPERLINK \l _Toc13627 </w:instrText>
           </w:r>
           <w:r>
             <w:rPr>
@@ -533,7 +543,17 @@
             <w:fldChar w:fldCharType="separate"/>
           </w:r>
           <w:r>
-            <w:t>1.1.2 Escalabilidade</w:t>
+            <w:t>1.1.</w:t>
+          </w:r>
+          <w:r>
+            <w:rPr>
+              <w:rFonts w:hint="default"/>
+              <w:lang w:val="pt-BR"/>
+            </w:rPr>
+            <w:t>2</w:t>
+          </w:r>
+          <w:r>
+            <w:t xml:space="preserve"> Concorrência</w:t>
           </w:r>
           <w:r>
             <w:tab/>
@@ -542,7 +562,7 @@
             <w:fldChar w:fldCharType="begin"/>
           </w:r>
           <w:r>
-            <w:instrText xml:space="preserve"> PAGEREF _Toc25195 \h </w:instrText>
+            <w:instrText xml:space="preserve"> PAGEREF _Toc13627 \h </w:instrText>
           </w:r>
           <w:r>
             <w:fldChar w:fldCharType="separate"/>
@@ -577,7 +597,7 @@
             <w:rPr>
               <w:bCs/>
             </w:rPr>
-            <w:instrText xml:space="preserve"> HYPERLINK \l _Toc6052 </w:instrText>
+            <w:instrText xml:space="preserve"> HYPERLINK \l _Toc18661 </w:instrText>
           </w:r>
           <w:r>
             <w:rPr>
@@ -586,7 +606,17 @@
             <w:fldChar w:fldCharType="separate"/>
           </w:r>
           <w:r>
-            <w:t>1.1.3 Abertura</w:t>
+            <w:t>1.1.</w:t>
+          </w:r>
+          <w:r>
+            <w:rPr>
+              <w:rFonts w:hint="default"/>
+              <w:lang w:val="pt-BR"/>
+            </w:rPr>
+            <w:t>3</w:t>
+          </w:r>
+          <w:r>
+            <w:t xml:space="preserve"> Escalabilidade</w:t>
           </w:r>
           <w:r>
             <w:tab/>
@@ -595,13 +625,13 @@
             <w:fldChar w:fldCharType="begin"/>
           </w:r>
           <w:r>
-            <w:instrText xml:space="preserve"> PAGEREF _Toc6052 \h </w:instrText>
+            <w:instrText xml:space="preserve"> PAGEREF _Toc18661 \h </w:instrText>
           </w:r>
           <w:r>
             <w:fldChar w:fldCharType="separate"/>
           </w:r>
           <w:r>
-            <w:t>5</w:t>
+            <w:t>4</w:t>
           </w:r>
           <w:r>
             <w:fldChar w:fldCharType="end"/>
@@ -630,7 +660,7 @@
             <w:rPr>
               <w:bCs/>
             </w:rPr>
-            <w:instrText xml:space="preserve"> HYPERLINK \l _Toc7680 </w:instrText>
+            <w:instrText xml:space="preserve"> HYPERLINK \l _Toc1720 </w:instrText>
           </w:r>
           <w:r>
             <w:rPr>
@@ -639,7 +669,17 @@
             <w:fldChar w:fldCharType="separate"/>
           </w:r>
           <w:r>
-            <w:t>1.1.4 Segurança</w:t>
+            <w:t>1.1.</w:t>
+          </w:r>
+          <w:r>
+            <w:rPr>
+              <w:rFonts w:hint="default"/>
+              <w:lang w:val="pt-BR"/>
+            </w:rPr>
+            <w:t>4</w:t>
+          </w:r>
+          <w:r>
+            <w:t xml:space="preserve"> Manuseio de Falhas</w:t>
           </w:r>
           <w:r>
             <w:tab/>
@@ -648,7 +688,7 @@
             <w:fldChar w:fldCharType="begin"/>
           </w:r>
           <w:r>
-            <w:instrText xml:space="preserve"> PAGEREF _Toc7680 \h </w:instrText>
+            <w:instrText xml:space="preserve"> PAGEREF _Toc1720 \h </w:instrText>
           </w:r>
           <w:r>
             <w:fldChar w:fldCharType="separate"/>
@@ -683,7 +723,7 @@
             <w:rPr>
               <w:bCs/>
             </w:rPr>
-            <w:instrText xml:space="preserve"> HYPERLINK \l _Toc14534 </w:instrText>
+            <w:instrText xml:space="preserve"> HYPERLINK \l _Toc23673 </w:instrText>
           </w:r>
           <w:r>
             <w:rPr>
@@ -692,7 +732,17 @@
             <w:fldChar w:fldCharType="separate"/>
           </w:r>
           <w:r>
-            <w:t>1.1.5 Manuseio de Falhas</w:t>
+            <w:t>1.1.</w:t>
+          </w:r>
+          <w:r>
+            <w:rPr>
+              <w:rFonts w:hint="default"/>
+              <w:lang w:val="pt-BR"/>
+            </w:rPr>
+            <w:t>5</w:t>
+          </w:r>
+          <w:r>
+            <w:t xml:space="preserve"> Heterogeneidade</w:t>
           </w:r>
           <w:r>
             <w:tab/>
@@ -701,7 +751,7 @@
             <w:fldChar w:fldCharType="begin"/>
           </w:r>
           <w:r>
-            <w:instrText xml:space="preserve"> PAGEREF _Toc14534 \h </w:instrText>
+            <w:instrText xml:space="preserve"> PAGEREF _Toc23673 \h </w:instrText>
           </w:r>
           <w:r>
             <w:fldChar w:fldCharType="separate"/>
@@ -736,7 +786,7 @@
             <w:rPr>
               <w:bCs/>
             </w:rPr>
-            <w:instrText xml:space="preserve"> HYPERLINK \l _Toc16150 </w:instrText>
+            <w:instrText xml:space="preserve"> HYPERLINK \l _Toc124 </w:instrText>
           </w:r>
           <w:r>
             <w:rPr>
@@ -745,7 +795,17 @@
             <w:fldChar w:fldCharType="separate"/>
           </w:r>
           <w:r>
-            <w:t>1.1.6 Concorrência</w:t>
+            <w:t>1.1.</w:t>
+          </w:r>
+          <w:r>
+            <w:rPr>
+              <w:rFonts w:hint="default"/>
+              <w:lang w:val="pt-BR"/>
+            </w:rPr>
+            <w:t>6</w:t>
+          </w:r>
+          <w:r>
+            <w:t xml:space="preserve"> Segurança</w:t>
           </w:r>
           <w:r>
             <w:tab/>
@@ -754,13 +814,13 @@
             <w:fldChar w:fldCharType="begin"/>
           </w:r>
           <w:r>
-            <w:instrText xml:space="preserve"> PAGEREF _Toc16150 \h </w:instrText>
+            <w:instrText xml:space="preserve"> PAGEREF _Toc124 \h </w:instrText>
           </w:r>
           <w:r>
             <w:fldChar w:fldCharType="separate"/>
           </w:r>
           <w:r>
-            <w:t>6</w:t>
+            <w:t>5</w:t>
           </w:r>
           <w:r>
             <w:fldChar w:fldCharType="end"/>
@@ -789,7 +849,7 @@
             <w:rPr>
               <w:bCs/>
             </w:rPr>
-            <w:instrText xml:space="preserve"> HYPERLINK \l _Toc18354 </w:instrText>
+            <w:instrText xml:space="preserve"> HYPERLINK \l _Toc27595 </w:instrText>
           </w:r>
           <w:r>
             <w:rPr>
@@ -807,7 +867,7 @@
             <w:fldChar w:fldCharType="begin"/>
           </w:r>
           <w:r>
-            <w:instrText xml:space="preserve"> PAGEREF _Toc18354 \h </w:instrText>
+            <w:instrText xml:space="preserve"> PAGEREF _Toc27595 \h </w:instrText>
           </w:r>
           <w:r>
             <w:fldChar w:fldCharType="separate"/>
@@ -842,7 +902,7 @@
             <w:rPr>
               <w:bCs/>
             </w:rPr>
-            <w:instrText xml:space="preserve"> HYPERLINK \l _Toc15592 </w:instrText>
+            <w:instrText xml:space="preserve"> HYPERLINK \l _Toc3654 </w:instrText>
           </w:r>
           <w:r>
             <w:rPr>
@@ -863,13 +923,133 @@
             <w:fldChar w:fldCharType="begin"/>
           </w:r>
           <w:r>
-            <w:instrText xml:space="preserve"> PAGEREF _Toc15592 \h </w:instrText>
+            <w:instrText xml:space="preserve"> PAGEREF _Toc3654 \h </w:instrText>
           </w:r>
           <w:r>
             <w:fldChar w:fldCharType="separate"/>
           </w:r>
           <w:r>
             <w:t>6</w:t>
+          </w:r>
+          <w:r>
+            <w:fldChar w:fldCharType="end"/>
+          </w:r>
+          <w:r>
+            <w:rPr>
+              <w:bCs/>
+            </w:rPr>
+            <w:fldChar w:fldCharType="end"/>
+          </w:r>
+        </w:p>
+        <w:p>
+          <w:pPr>
+            <w:pStyle w:val="23"/>
+            <w:tabs>
+              <w:tab w:val="right" w:leader="dot" w:pos="9072"/>
+            </w:tabs>
+          </w:pPr>
+          <w:r>
+            <w:rPr>
+              <w:bCs/>
+            </w:rPr>
+            <w:fldChar w:fldCharType="begin"/>
+          </w:r>
+          <w:r>
+            <w:rPr>
+              <w:bCs/>
+            </w:rPr>
+            <w:instrText xml:space="preserve"> HYPERLINK \l _Toc31309 </w:instrText>
+          </w:r>
+          <w:r>
+            <w:rPr>
+              <w:bCs/>
+            </w:rPr>
+            <w:fldChar w:fldCharType="separate"/>
+          </w:r>
+          <w:r>
+            <w:rPr>
+              <w:rFonts w:hint="default"/>
+              <w:lang w:val="pt-BR"/>
+            </w:rPr>
+            <w:t xml:space="preserve">1.2.1 </w:t>
+          </w:r>
+          <w:r>
+            <w:rPr>
+              <w:rFonts w:hint="default"/>
+            </w:rPr>
+            <w:t>Tecnologia</w:t>
+          </w:r>
+          <w:r>
+            <w:tab/>
+          </w:r>
+          <w:r>
+            <w:fldChar w:fldCharType="begin"/>
+          </w:r>
+          <w:r>
+            <w:instrText xml:space="preserve"> PAGEREF _Toc31309 \h </w:instrText>
+          </w:r>
+          <w:r>
+            <w:fldChar w:fldCharType="separate"/>
+          </w:r>
+          <w:r>
+            <w:t>7</w:t>
+          </w:r>
+          <w:r>
+            <w:fldChar w:fldCharType="end"/>
+          </w:r>
+          <w:r>
+            <w:rPr>
+              <w:bCs/>
+            </w:rPr>
+            <w:fldChar w:fldCharType="end"/>
+          </w:r>
+        </w:p>
+        <w:p>
+          <w:pPr>
+            <w:pStyle w:val="23"/>
+            <w:tabs>
+              <w:tab w:val="right" w:leader="dot" w:pos="9072"/>
+            </w:tabs>
+          </w:pPr>
+          <w:r>
+            <w:rPr>
+              <w:bCs/>
+            </w:rPr>
+            <w:fldChar w:fldCharType="begin"/>
+          </w:r>
+          <w:r>
+            <w:rPr>
+              <w:bCs/>
+            </w:rPr>
+            <w:instrText xml:space="preserve"> HYPERLINK \l _Toc31172 </w:instrText>
+          </w:r>
+          <w:r>
+            <w:rPr>
+              <w:bCs/>
+            </w:rPr>
+            <w:fldChar w:fldCharType="separate"/>
+          </w:r>
+          <w:r>
+            <w:rPr>
+              <w:rFonts w:hint="default"/>
+              <w:lang w:val="pt-BR"/>
+            </w:rPr>
+            <w:t>1.2.2 Arquitetura</w:t>
+          </w:r>
+          <w:r>
+            <w:tab/>
+          </w:r>
+          <w:r>
+            <w:fldChar w:fldCharType="begin"/>
+          </w:r>
+          <w:r>
+            <w:instrText xml:space="preserve"> PAGEREF _Toc31172 \h </w:instrText>
+          </w:r>
+          <w:r>
+            <w:fldChar w:fldCharType="separate"/>
+          </w:r>
+          <w:r>
+            <w:t>7</w:t>
           </w:r>
           <w:r>
             <w:fldChar w:fldCharType="end"/>
@@ -898,7 +1078,7 @@
             <w:rPr>
               <w:bCs/>
             </w:rPr>
-            <w:instrText xml:space="preserve"> HYPERLINK \l _Toc19223 </w:instrText>
+            <w:instrText xml:space="preserve"> HYPERLINK \l _Toc14060 </w:instrText>
           </w:r>
           <w:r>
             <w:rPr>
@@ -916,7 +1096,7 @@
             <w:fldChar w:fldCharType="begin"/>
           </w:r>
           <w:r>
-            <w:instrText xml:space="preserve"> PAGEREF _Toc19223 \h </w:instrText>
+            <w:instrText xml:space="preserve"> PAGEREF _Toc14060 \h </w:instrText>
           </w:r>
           <w:r>
             <w:fldChar w:fldCharType="separate"/>
@@ -967,7 +1147,7 @@
       <w:bookmarkStart w:id="1" w:name="_Toc14345934"/>
       <w:bookmarkStart w:id="2" w:name="_Toc507747267"/>
       <w:bookmarkStart w:id="3" w:name="_Toc46909575"/>
-      <w:bookmarkStart w:id="4" w:name="_Toc18930"/>
+      <w:bookmarkStart w:id="4" w:name="_Toc27094"/>
       <w:r>
         <w:t xml:space="preserve">1 </w:t>
       </w:r>
@@ -980,9 +1160,9 @@
       <w:bookmarkEnd w:id="4"/>
     </w:p>
     <w:p>
-      <w:bookmarkStart w:id="5" w:name="_Toc507747268"/>
-      <w:bookmarkStart w:id="6" w:name="_Toc46909576"/>
-      <w:bookmarkStart w:id="7" w:name="_Toc14345935"/>
+      <w:bookmarkStart w:id="5" w:name="_Toc46909576"/>
+      <w:bookmarkStart w:id="6" w:name="_Toc14345935"/>
+      <w:bookmarkStart w:id="7" w:name="_Toc507747268"/>
       <w:r>
         <w:rPr>
           <w:rFonts w:hint="default"/>
@@ -1006,7 +1186,7 @@
       <w:pPr>
         <w:pStyle w:val="3"/>
       </w:pPr>
-      <w:bookmarkStart w:id="8" w:name="_Toc19481"/>
+      <w:bookmarkStart w:id="8" w:name="_Toc18925"/>
       <w:r>
         <w:rPr>
           <w:caps w:val="0"/>
@@ -1083,50 +1263,61 @@
           <w:rFonts w:hint="default"/>
         </w:rPr>
       </w:pPr>
-      <w:r>
-        <w:rPr>
-          <w:rFonts w:hint="default"/>
-        </w:rPr>
-        <w:t>Abertura</w:t>
+    </w:p>
+    <w:p>
+      <w:pPr>
+        <w:pStyle w:val="4"/>
+      </w:pPr>
+      <w:bookmarkStart w:id="9" w:name="_Toc32638"/>
+      <w:r>
+        <w:t>1.1.</w:t>
       </w:r>
       <w:r>
         <w:rPr>
           <w:rFonts w:hint="default"/>
           <w:lang w:val="pt-BR"/>
         </w:rPr>
-        <w:t xml:space="preserve">: </w:t>
-      </w:r>
-      <w:r>
+        <w:t>1</w:t>
+      </w:r>
+      <w:r>
+        <w:t xml:space="preserve"> Abertura</w:t>
+      </w:r>
+      <w:bookmarkEnd w:id="9"/>
+    </w:p>
+    <w:p>
+      <w:pPr>
         <w:rPr>
           <w:rFonts w:hint="default"/>
         </w:rPr>
-        <w:t>O SAGE adota padrões de comunicação baseados em APIs REST e protocolos amplamente utilizados, o que permite a integração com outros sistemas de saúde ou aplicações auxiliares. Essa abertura garante que o sistema possa evoluir e se adaptar a novas necessidades sem comprometer sua interoperabilidade.</w:t>
-      </w:r>
-    </w:p>
-    <w:p>
-      <w:pPr>
-        <w:rPr>
-          <w:rFonts w:hint="default"/>
-        </w:rPr>
-      </w:pPr>
-      <w:r>
-        <w:rPr>
-          <w:rFonts w:hint="default"/>
-        </w:rPr>
-        <w:t>Escalabilidade</w:t>
+      </w:pPr>
+      <w:bookmarkStart w:id="10" w:name="_Hlk165908896"/>
+      <w:r>
+        <w:rPr>
+          <w:bCs/>
+          <w:szCs w:val="24"/>
+        </w:rPr>
+        <w:t>A abertura em sistemas distribuídos refere-se à capacidade do sistema de ser ampliado e modificado com facilidade, permitindo a integração de novos componentes, serviços ou tecnologias, sem prejudicas o funcionamento global. Segundo Coulouris, Dolimore e Kindberg (2007), um sistema distribuído aberto é aquele que oferece interfaces bem definidas e padronizadas, facilitando a interoperabilidade entre componentes de diferentes fornecedores e plataformas</w:t>
+      </w:r>
+      <w:bookmarkEnd w:id="10"/>
+      <w:r>
+        <w:rPr>
+          <w:bCs/>
+          <w:szCs w:val="24"/>
+        </w:rPr>
+        <w:t>.</w:t>
       </w:r>
       <w:r>
         <w:rPr>
           <w:rFonts w:hint="default"/>
           <w:lang w:val="pt-BR"/>
         </w:rPr>
-        <w:t xml:space="preserve">: </w:t>
+        <w:t xml:space="preserve"> </w:t>
       </w:r>
       <w:r>
         <w:rPr>
           <w:rFonts w:hint="default"/>
         </w:rPr>
-        <w:t>O projeto foi estruturado de forma modular, permitindo que novas funcionalidades sejam incorporadas e que a aplicação suporte um número crescente de usuários. Esse cuidado garante que o sistema possa ser utilizado tanto em pequenas instituições quanto em redes maiores de asilos.</w:t>
+        <w:t>O SAGE adota padrões de comunicação baseados em APIs REST e protocolos amplamente utilizados, o que permite a integração com outros sistemas de saúde ou aplicações auxiliares. Essa abertura garante que o sistema possa evoluir e se adaptar a novas necessidades sem comprometer sua interoperabilidade.</w:t>
       </w:r>
     </w:p>
     <w:p>
@@ -1135,270 +1326,277 @@
           <w:rFonts w:hint="default"/>
         </w:rPr>
       </w:pPr>
-      <w:r>
-        <w:rPr>
-          <w:rFonts w:hint="default"/>
-        </w:rPr>
-        <w:t>Falha</w:t>
+    </w:p>
+    <w:p>
+      <w:pPr>
+        <w:pStyle w:val="4"/>
+      </w:pPr>
+      <w:bookmarkStart w:id="11" w:name="_Toc13627"/>
+      <w:r>
+        <w:t>1.1.</w:t>
       </w:r>
       <w:r>
         <w:rPr>
           <w:rFonts w:hint="default"/>
           <w:lang w:val="pt-BR"/>
         </w:rPr>
-        <w:t xml:space="preserve">: </w:t>
-      </w:r>
-      <w:r>
-        <w:rPr>
-          <w:rFonts w:hint="default"/>
-        </w:rPr>
-        <w:t>O SAGE considera a possibilidade de falhas parciais, como indisponibilidade de rede ou queda de servidor. Para isso, o sistema indica o status de conectividade com a central de alarmes, sincronizando-os assim que a comunicação é restabelecida.</w:t>
-      </w:r>
-    </w:p>
-    <w:p>
-      <w:pPr>
-        <w:rPr>
-          <w:rFonts w:hint="default"/>
-        </w:rPr>
-      </w:pPr>
-      <w:r>
-        <w:rPr>
-          <w:rFonts w:hint="default"/>
-        </w:rPr>
-        <w:t>Heterogeneidade</w:t>
+        <w:t>2</w:t>
+      </w:r>
+      <w:r>
+        <w:t xml:space="preserve"> Concorrência</w:t>
+      </w:r>
+      <w:bookmarkEnd w:id="11"/>
+    </w:p>
+    <w:p>
+      <w:pPr>
+        <w:rPr>
+          <w:bCs/>
+          <w:szCs w:val="24"/>
+        </w:rPr>
+      </w:pPr>
+      <w:r>
+        <w:rPr>
+          <w:bCs/>
+          <w:szCs w:val="24"/>
+        </w:rPr>
+        <w:t>A concorrência é um desafio central em sistemas distribuídos, pois vários processos podem ser executados simultaneamente, em diferentes nós, interagindo entre si e compartilhando recursos. De acordo com Silberschatz, Galvin e Gagne (2008), a gerência de concorrência envolve o controle de acesso a recursos compartilhados para evitar conflitos, garantir a consistência e preservar a integridade do sistema diante da execução paralela.</w:t>
+      </w:r>
+    </w:p>
+    <w:p/>
+    <w:p>
+      <w:pPr>
+        <w:pStyle w:val="4"/>
+      </w:pPr>
+      <w:bookmarkStart w:id="12" w:name="_Toc18661"/>
+      <w:r>
+        <w:t>1.1.</w:t>
       </w:r>
       <w:r>
         <w:rPr>
           <w:rFonts w:hint="default"/>
           <w:lang w:val="pt-BR"/>
         </w:rPr>
-        <w:t xml:space="preserve">: </w:t>
-      </w:r>
-      <w:r>
-        <w:rPr>
-          <w:rFonts w:hint="default"/>
-        </w:rPr>
-        <w:t>O sistema foi desenvolvido para ser acessível a partir de diferentes dispositivos, como computadores, tablets e smartphones, independentemente do sistema operacional utilizado. Isso garante flexibilidade para a equipe médica e de enfermagem, que pode interagir com a aplicação conforme seus recursos disponíveis.</w:t>
-      </w:r>
-    </w:p>
-    <w:p>
-      <w:r>
-        <w:rPr>
-          <w:rFonts w:hint="default"/>
-        </w:rPr>
-        <w:t>Transparência</w:t>
-      </w:r>
-      <w:r>
+        <w:t>3</w:t>
+      </w:r>
+      <w:r>
+        <w:t xml:space="preserve"> Escalabilidade</w:t>
+      </w:r>
+      <w:bookmarkEnd w:id="12"/>
+    </w:p>
+    <w:p>
+      <w:pPr>
         <w:rPr>
           <w:rFonts w:hint="default"/>
           <w:lang w:val="pt-BR"/>
         </w:rPr>
-        <w:t xml:space="preserve">: </w:t>
+      </w:pPr>
+      <w:r>
+        <w:rPr>
+          <w:bCs/>
+          <w:szCs w:val="24"/>
+        </w:rPr>
+        <w:t>Escalabilidade refere-se à capacidade do sistema de continuar operando eficientemente à medida que cresce o tamanho ou número de usuários. Conforme Tanenbaum e Steen (2007), um sistema distribuído escalável deve manter seu desempenho e funcionalidade mesmo quando novos nós são adicionados ou quando há aumento significativo na carga de trabalho.</w:t>
       </w:r>
       <w:r>
         <w:rPr>
           <w:rFonts w:hint="default"/>
+          <w:bCs/>
+          <w:szCs w:val="24"/>
+          <w:lang w:val="pt-BR"/>
+        </w:rPr>
+        <w:t xml:space="preserve"> </w:t>
+      </w:r>
+      <w:r>
+        <w:rPr>
+          <w:rFonts w:hint="default"/>
+        </w:rPr>
+        <w:t>O projeto foi estruturado de forma modular, permitindo que novas funcionalidades sejam incorporadas e que a aplicação suporte um número crescente de usuários. Esse cuidado garante que o sistema possa ser utilizado tanto em pequenas instituições quanto em redes maiores de asilos</w:t>
+      </w:r>
+      <w:r>
+        <w:rPr>
+          <w:rFonts w:hint="default"/>
+          <w:lang w:val="pt-BR"/>
+        </w:rPr>
+        <w:t>.</w:t>
+      </w:r>
+    </w:p>
+    <w:p>
+      <w:pPr>
+        <w:pStyle w:val="4"/>
+      </w:pPr>
+      <w:bookmarkStart w:id="13" w:name="_Toc1720"/>
+      <w:r>
+        <w:t>1.1.</w:t>
+      </w:r>
+      <w:r>
+        <w:rPr>
+          <w:rFonts w:hint="default"/>
+          <w:lang w:val="pt-BR"/>
+        </w:rPr>
+        <w:t>4</w:t>
+      </w:r>
+      <w:r>
+        <w:t xml:space="preserve"> Manuseio de Falhas</w:t>
+      </w:r>
+      <w:bookmarkEnd w:id="13"/>
+    </w:p>
+    <w:p>
+      <w:pPr>
+        <w:rPr>
+          <w:rFonts w:hint="default"/>
+          <w:bCs/>
+          <w:szCs w:val="24"/>
+          <w:lang w:val="pt-BR"/>
+        </w:rPr>
+      </w:pPr>
+      <w:r>
+        <w:rPr>
+          <w:bCs/>
+          <w:szCs w:val="24"/>
+        </w:rPr>
+        <w:t>Falhas são inevitáveis em ambientes distribuídos e representa um dos maiores desafios. Um sistema distribuído deve ser capaz de detectar, isolar e recuperar-se de falhas de hardware, software ou comunicação, mantendo a consistência e a disponibilidade dos serviços. Tanenbaum e Steen (2007) destacam que, devido à ausência de um ponto central de controle, a tolerância a falhas é essencial para garantir a confiabilidade desses sistemas.</w:t>
+      </w:r>
+      <w:r>
+        <w:rPr>
+          <w:rFonts w:hint="default"/>
+          <w:bCs/>
+          <w:szCs w:val="24"/>
+          <w:lang w:val="pt-BR"/>
+        </w:rPr>
+        <w:t xml:space="preserve"> </w:t>
+      </w:r>
+      <w:r>
+        <w:rPr>
+          <w:rFonts w:hint="default"/>
+        </w:rPr>
+        <w:t>O SAGE considera a possibilidade de falhas parciais, como indisponibilidade de rede ou queda de servidor. Para isso, o sistema indica o status de conectividade com a central de alarmes, sincronizando-os assim que a comunicação é restabelecida.</w:t>
+      </w:r>
+    </w:p>
+    <w:p>
+      <w:pPr>
+        <w:pStyle w:val="4"/>
+      </w:pPr>
+    </w:p>
+    <w:p>
+      <w:pPr>
+        <w:pStyle w:val="4"/>
+      </w:pPr>
+      <w:bookmarkStart w:id="14" w:name="_Toc23673"/>
+      <w:r>
+        <w:t>1.1.</w:t>
+      </w:r>
+      <w:r>
+        <w:rPr>
+          <w:rFonts w:hint="default"/>
+          <w:lang w:val="pt-BR"/>
+        </w:rPr>
+        <w:t>5</w:t>
+      </w:r>
+      <w:r>
+        <w:t xml:space="preserve"> Heterogeneidade</w:t>
+      </w:r>
+      <w:bookmarkEnd w:id="14"/>
+    </w:p>
+    <w:p>
+      <w:r>
+        <w:rPr>
+          <w:bCs/>
+          <w:szCs w:val="24"/>
+        </w:rPr>
+        <w:t>Heterogeneidade é a variação nos tipos de hardware, sistemas operacionais, linguagens de programação, protocolos de comunicação e arquiteturas de rede que compõem um sistema distribuído. Segundo Coulouris et al. (2007), a heterogeneidade exige que o sistema distribua recursos e serviços de forma transparente, independentemente das diferenças tecnológicas entre os componentes.</w:t>
+      </w:r>
+      <w:r>
+        <w:rPr>
+          <w:rFonts w:hint="default"/>
+          <w:bCs/>
+          <w:szCs w:val="24"/>
+          <w:lang w:val="pt-BR"/>
+        </w:rPr>
+        <w:t xml:space="preserve"> </w:t>
+      </w:r>
+      <w:r>
+        <w:rPr>
+          <w:rFonts w:hint="default"/>
+        </w:rPr>
+        <w:t>O sistema foi desenvolvido para ser acessível a partir de diferentes dispositivos, como computadores, tablets e smartphones, independentemente do sistema operacional utilizado. Isso garante flexibilidade para a equipe médica e de enfermagem, que pode interagir com a aplicação conforme seus recursos disponíveis.</w:t>
+      </w:r>
+    </w:p>
+    <w:p/>
+    <w:p>
+      <w:pPr>
+        <w:pStyle w:val="4"/>
+      </w:pPr>
+      <w:bookmarkStart w:id="15" w:name="_Toc124"/>
+      <w:r>
+        <w:t>1.1.</w:t>
+      </w:r>
+      <w:r>
+        <w:rPr>
+          <w:rFonts w:hint="default"/>
+          <w:lang w:val="pt-BR"/>
+        </w:rPr>
+        <w:t>6</w:t>
+      </w:r>
+      <w:r>
+        <w:t xml:space="preserve"> Segurança</w:t>
+      </w:r>
+      <w:bookmarkEnd w:id="15"/>
+    </w:p>
+    <w:p>
+      <w:pPr>
+        <w:rPr>
+          <w:bCs/>
+          <w:szCs w:val="24"/>
+        </w:rPr>
+      </w:pPr>
+      <w:r>
+        <w:rPr>
+          <w:bCs/>
+          <w:szCs w:val="24"/>
+        </w:rPr>
+        <w:t>Segurança em sistemas distribuídos abrange a proteção contra acessos não autorizados, ataques maliciosos, interceptações de dados e falhas de integridade. Silberchatz, Galvin e Gagne (2008) afirmam que a descentralização e o uso de redes públicas tornam a segurança ainda mais crítica, exigindo técnicas de autenticação, criptografia, controle de acesso e auditoria.</w:t>
+      </w:r>
+    </w:p>
+    <w:p>
+      <w:pPr>
+        <w:pStyle w:val="4"/>
+      </w:pPr>
+      <w:bookmarkStart w:id="16" w:name="_Toc27595"/>
+      <w:r>
+        <w:t>1.1.7 Transparência</w:t>
+      </w:r>
+      <w:bookmarkEnd w:id="16"/>
+    </w:p>
+    <w:p>
+      <w:pPr>
+        <w:rPr>
+          <w:bCs/>
+          <w:szCs w:val="24"/>
+        </w:rPr>
+      </w:pPr>
+      <w:r>
+        <w:rPr>
+          <w:bCs/>
+          <w:szCs w:val="24"/>
+        </w:rPr>
+        <w:t>A transparência em sistemas distribuídos consiste na capacidade de ocultar a complexidade da distribuição dos recursos e a multiplicidade de nós ao usuário final. Como definido por Tanenbaum e Steen (2007), há diversos tipos de transparência, incluindo transparência de localização, acesso, replicação, concorrência, falhas e migração, permitindo que o sistema seja percebido como uma única entidade coesa.</w:t>
+      </w:r>
+      <w:r>
+        <w:rPr>
+          <w:rFonts w:hint="default"/>
+          <w:lang w:val="pt-BR"/>
+        </w:rPr>
+        <w:t xml:space="preserve"> </w:t>
+      </w:r>
+      <w:r>
+        <w:rPr>
+          <w:rFonts w:hint="default"/>
         </w:rPr>
         <w:t>O SAGE busca oferecer ao usuário uma experiência transparente, ocultando a complexidade da infraestrutura distribuída. Assim, o enfermeiro interage com uma interface simples e intuitiva, sem precisar se preocupar com os processos técnicos de comunicação, sincronização ou armazenamento de dados.</w:t>
       </w:r>
     </w:p>
     <w:p>
       <w:pPr>
-        <w:pStyle w:val="4"/>
-      </w:pPr>
-    </w:p>
-    <w:p>
-      <w:pPr>
-        <w:pStyle w:val="4"/>
-      </w:pPr>
-      <w:bookmarkStart w:id="9" w:name="_Toc30514"/>
-      <w:r>
-        <w:t>1.1.1 Heterogeneidade</w:t>
-      </w:r>
-      <w:bookmarkEnd w:id="9"/>
-    </w:p>
-    <w:p>
-      <w:pPr>
-        <w:rPr>
-          <w:bCs/>
-          <w:szCs w:val="24"/>
-        </w:rPr>
-      </w:pPr>
-      <w:r>
-        <w:rPr>
-          <w:bCs/>
-          <w:szCs w:val="24"/>
-        </w:rPr>
-        <w:t xml:space="preserve">Heterogeneidade é a variação nos tipos de hardware, sistemas operacionais, linguagens de programação, protocolos de comunicação e arquiteturas de rede que compõem um sistema distribuído. Segundo Coulouris et al. (2007), a heterogeneidade exige que o sistema distribua recursos e serviços de forma transparente, independentemente das diferenças tecnológicas entre os componentes. </w:t>
-      </w:r>
-    </w:p>
-    <w:p/>
-    <w:p>
-      <w:pPr>
-        <w:pStyle w:val="4"/>
-      </w:pPr>
-      <w:bookmarkStart w:id="10" w:name="_Toc25195"/>
-      <w:r>
-        <w:t>1.1.2 Escalabilidade</w:t>
-      </w:r>
-      <w:bookmarkEnd w:id="10"/>
-    </w:p>
-    <w:p>
-      <w:pPr>
-        <w:rPr>
-          <w:bCs/>
-          <w:szCs w:val="24"/>
-        </w:rPr>
-      </w:pPr>
-      <w:r>
-        <w:rPr>
-          <w:bCs/>
-          <w:szCs w:val="24"/>
-        </w:rPr>
-        <w:t>Escalabilidade refere-se à capacidade do sistema de continuar operando eficientemente à medida que cresce o tamanho ou número de usuários. Conforme Tanenbaum e Steen (2007), um sistema distribuído escalável deve manter seu desempenho e funcionalidade mesmo quando novos nós são adicionados ou quando há aumento significativo na carga de trabalho.</w:t>
-      </w:r>
-    </w:p>
-    <w:p/>
-    <w:p>
-      <w:pPr>
-        <w:pStyle w:val="4"/>
-      </w:pPr>
-      <w:bookmarkStart w:id="11" w:name="_Toc6052"/>
-      <w:r>
-        <w:t>1.1.3 Abertura</w:t>
-      </w:r>
-      <w:bookmarkEnd w:id="11"/>
-    </w:p>
-    <w:p>
-      <w:pPr>
-        <w:rPr>
-          <w:bCs/>
-          <w:szCs w:val="24"/>
-        </w:rPr>
-      </w:pPr>
-      <w:bookmarkStart w:id="12" w:name="_Hlk165908896"/>
-      <w:r>
-        <w:rPr>
-          <w:bCs/>
-          <w:szCs w:val="24"/>
-        </w:rPr>
-        <w:t>A abertura em sistemas distribuídos refere-se à capacidade do sistema de ser ampliado e modificado com facilidade, permitindo a integração de novos componentes, serviços ou tecnologias, sem prejudicas o funcionamento global. Segundo Coulouris, Dolimore e Kindberg (2007), um sistema distribuído aberto é aquele que oferece interfaces bem definidas e padronizadas, facilitando a interoperabilidade entre componentes de diferentes fornecedores e plataformas</w:t>
-      </w:r>
-      <w:bookmarkEnd w:id="12"/>
-      <w:r>
-        <w:rPr>
-          <w:bCs/>
-          <w:szCs w:val="24"/>
-        </w:rPr>
-        <w:t xml:space="preserve">. </w:t>
-      </w:r>
-    </w:p>
-    <w:p/>
-    <w:p>
-      <w:pPr>
-        <w:pStyle w:val="4"/>
-      </w:pPr>
-      <w:bookmarkStart w:id="13" w:name="_Toc7680"/>
-      <w:r>
-        <w:t>1.1.4 Segurança</w:t>
-      </w:r>
-      <w:bookmarkEnd w:id="13"/>
-    </w:p>
-    <w:p>
-      <w:pPr>
-        <w:rPr>
-          <w:bCs/>
-          <w:szCs w:val="24"/>
-        </w:rPr>
-      </w:pPr>
-      <w:r>
-        <w:rPr>
-          <w:bCs/>
-          <w:szCs w:val="24"/>
-        </w:rPr>
-        <w:t>Segurança em sistemas distribuídos abrange a proteção contra acessos não autorizados, ataques maliciosos, interceptações de dados e falhas de integridade. Silberchatz, Galvin e Gagne (2008) afirmam que a descentralização e o uso de redes públicas tornam a segurança ainda mais crítica, exigindo técnicas de autenticação, criptografia, controle de acesso e auditoria.</w:t>
-      </w:r>
-    </w:p>
-    <w:p/>
-    <w:p>
-      <w:pPr>
-        <w:pStyle w:val="4"/>
-      </w:pPr>
-      <w:bookmarkStart w:id="14" w:name="_Toc14534"/>
-      <w:r>
-        <w:t>1.1.5 Manuseio de Falhas</w:t>
-      </w:r>
-      <w:bookmarkEnd w:id="14"/>
-    </w:p>
-    <w:p>
-      <w:pPr>
-        <w:rPr>
-          <w:bCs/>
-          <w:szCs w:val="24"/>
-        </w:rPr>
-      </w:pPr>
-      <w:r>
-        <w:rPr>
-          <w:bCs/>
-          <w:szCs w:val="24"/>
-        </w:rPr>
-        <w:t>Falhas são inevitáveis em ambientes distribuídos e representa um dos maiores desafios. Um sistema distribuído deve ser capaz de detectar, isolar e recuperar-se de falhas de hardware, software ou comunicação, mantendo a consistência e a disponibilidade dos serviços. Tanenbaum e Steen (2007) destacam que, devido à ausência de um ponto central de controle, a tolerância a falhas é essencial para garantir a confiabilidade desses sistemas.</w:t>
-      </w:r>
-    </w:p>
-    <w:p/>
-    <w:p>
-      <w:pPr>
-        <w:pStyle w:val="4"/>
-      </w:pPr>
-      <w:bookmarkStart w:id="15" w:name="_Toc16150"/>
-      <w:r>
-        <w:t>1.1.6 Concorrência</w:t>
-      </w:r>
-      <w:bookmarkEnd w:id="15"/>
-    </w:p>
-    <w:p>
-      <w:pPr>
-        <w:rPr>
-          <w:bCs/>
-          <w:szCs w:val="24"/>
-        </w:rPr>
-      </w:pPr>
-      <w:r>
-        <w:rPr>
-          <w:bCs/>
-          <w:szCs w:val="24"/>
-        </w:rPr>
-        <w:t>A concorrência é um desafio central em sistemas distribuídos, pois vários processos podem ser executados simultaneamente, em diferentes nós, interagindo entre si e compartilhando recursos. De acordo com Silberschatz, Galvin e Gagne (2008), a gerência de concorrência envolve o controle de acesso a recursos compartilhados para evitar conflitos, garantir a consistência e preservar a integridade do sistema diante da execução paralela.</w:t>
-      </w:r>
-    </w:p>
-    <w:p/>
-    <w:p>
-      <w:pPr>
-        <w:pStyle w:val="4"/>
-      </w:pPr>
-      <w:bookmarkStart w:id="16" w:name="_Toc18354"/>
-      <w:r>
-        <w:t>1.1.7 Transparência</w:t>
-      </w:r>
-      <w:bookmarkEnd w:id="16"/>
-    </w:p>
-    <w:p>
-      <w:pPr>
-        <w:rPr>
-          <w:bCs/>
-          <w:szCs w:val="24"/>
-        </w:rPr>
-      </w:pPr>
-      <w:r>
-        <w:rPr>
-          <w:bCs/>
-          <w:szCs w:val="24"/>
-        </w:rPr>
-        <w:t xml:space="preserve">A transparência em sistemas distribuídos consiste na capacidade de ocultar a complexidade da distribuição dos recursos e a multiplicidade de nós ao usuário final. Como definido por Tanenbaum e Steen (2007), há diversos tipos de transparência, incluindo transparência de localização, acesso, replicação, concorrência, falhas e migração, permitindo que o sistema seja percebido como uma única entidade coesa. </w:t>
-      </w:r>
-    </w:p>
-    <w:p>
-      <w:pPr>
         <w:rPr>
           <w:rFonts w:eastAsia="Arial Unicode MS"/>
         </w:rPr>
@@ -1411,10 +1609,10 @@
           <w:caps w:val="0"/>
         </w:rPr>
       </w:pPr>
-      <w:bookmarkStart w:id="17" w:name="_Toc46909577"/>
-      <w:bookmarkStart w:id="18" w:name="_Toc14345936"/>
+      <w:bookmarkStart w:id="17" w:name="_Toc14345936"/>
+      <w:bookmarkStart w:id="18" w:name="_Toc46909577"/>
       <w:bookmarkStart w:id="19" w:name="_Toc507747269"/>
-      <w:bookmarkStart w:id="20" w:name="_Toc15592"/>
+      <w:bookmarkStart w:id="20" w:name="_Toc3654"/>
       <w:r>
         <w:rPr>
           <w:caps w:val="0"/>
@@ -1459,10 +1657,13 @@
     <w:p>
       <w:pPr>
         <w:rPr>
+          <w:rFonts w:hint="default"/>
           <w:bCs/>
           <w:szCs w:val="24"/>
         </w:rPr>
       </w:pPr>
+      <w:bookmarkStart w:id="24" w:name="_GoBack"/>
+      <w:bookmarkEnd w:id="24"/>
       <w:r>
         <w:rPr>
           <w:bCs/>
@@ -1484,39 +1685,112 @@
           <w:bCs/>
           <w:szCs w:val="24"/>
         </w:rPr>
-        <w:t>, linguagens e ferramentas utilizadas para implementar essas arquiteturas, permitindo a interoperabilidade entre sistemas heterogêneos, Exemplos incluem CORBA, RMI, Web Services, REST, gRPC, Docker, Kubenetes , entre outros.</w:t>
-      </w:r>
-    </w:p>
-    <w:p>
-      <w:pPr>
-        <w:rPr>
+        <w:t>, linguagens e ferramentas utilizadas para implementar essas arquiteturas, permitindo a interoperabilidade entre sistemas heterogêneos, Exemplos incluem CORBA, RMI, Web Services, REST, gRPC, Docker, Kubenetes , entre outros.Esses elementos são fundamentais para garantir aspectos como eficiência, escalabilidade, segurança e tolerância a falhas em sistemas distribuídos modernos.</w:t>
+      </w:r>
+      <w:r>
+        <w:rPr>
+          <w:rFonts w:hint="default"/>
           <w:bCs/>
           <w:szCs w:val="24"/>
         </w:rPr>
-      </w:pPr>
-      <w:r>
-        <w:rPr>
-          <w:bCs/>
-          <w:szCs w:val="24"/>
-        </w:rPr>
-        <w:t>Esses elementos são fundamentais para garantir aspectos como eficiência, escalabilidade, segurança e tolerância a falhas em sistemas distribuídos modernos.</w:t>
-      </w:r>
+        <w:t>No caso do SAGE, trata-se de uma aplicação web local projetada para receber alertas de emergências médicas via controle remoto (RF) de uma central de alarmes. Para a implementação do sistema, foram utilizadas as seguintes tecnologias e arquiteturas:</w:t>
+      </w:r>
+    </w:p>
+    <w:p>
+      <w:pPr>
+        <w:pStyle w:val="4"/>
+        <w:bidi w:val="0"/>
+        <w:rPr>
+          <w:rFonts w:hint="default"/>
+        </w:rPr>
+      </w:pPr>
+      <w:bookmarkStart w:id="21" w:name="_Toc31309"/>
+      <w:r>
+        <w:rPr>
+          <w:rFonts w:hint="default"/>
+          <w:lang w:val="pt-BR"/>
+        </w:rPr>
+        <w:t xml:space="preserve">1.2.1 </w:t>
+      </w:r>
+      <w:r>
+        <w:rPr>
+          <w:rFonts w:hint="default"/>
+        </w:rPr>
+        <w:t>Tecnologia</w:t>
+      </w:r>
+      <w:bookmarkEnd w:id="21"/>
     </w:p>
     <w:p>
       <w:pPr>
         <w:pStyle w:val="34"/>
         <w:ind w:left="0"/>
         <w:rPr>
+          <w:rFonts w:hint="default"/>
           <w:bCs/>
           <w:szCs w:val="24"/>
         </w:rPr>
       </w:pPr>
       <w:r>
         <w:rPr>
+          <w:rFonts w:hint="default"/>
           <w:bCs/>
           <w:szCs w:val="24"/>
         </w:rPr>
-        <w:t>A seguir o diagrama de sistemas distribuídos do projeto.</w:t>
+        <w:t xml:space="preserve">O SAGE foi desenvolvido como uma aplicação web local utilizando REST para comunicação entre o </w:t>
+      </w:r>
+      <w:r>
+        <w:rPr>
+          <w:rFonts w:hint="default"/>
+          <w:bCs/>
+          <w:i/>
+          <w:iCs/>
+          <w:szCs w:val="24"/>
+        </w:rPr>
+        <w:t>front-end</w:t>
+      </w:r>
+      <w:r>
+        <w:rPr>
+          <w:rFonts w:hint="default"/>
+          <w:bCs/>
+          <w:szCs w:val="24"/>
+        </w:rPr>
+        <w:t xml:space="preserve"> e o </w:t>
+      </w:r>
+      <w:r>
+        <w:rPr>
+          <w:rFonts w:hint="default"/>
+          <w:bCs/>
+          <w:i/>
+          <w:iCs/>
+          <w:szCs w:val="24"/>
+        </w:rPr>
+        <w:t>back-end</w:t>
+      </w:r>
+      <w:r>
+        <w:rPr>
+          <w:rFonts w:hint="default"/>
+          <w:bCs/>
+          <w:szCs w:val="24"/>
+        </w:rPr>
+        <w:t xml:space="preserve">, garantindo interoperabilidade e facilidade de integração futura com outros sistemas. O projeto também faz uso de </w:t>
+      </w:r>
+      <w:r>
+        <w:rPr>
+          <w:rFonts w:hint="default"/>
+          <w:bCs/>
+          <w:i/>
+          <w:iCs/>
+          <w:szCs w:val="24"/>
+        </w:rPr>
+        <w:t>middlewares</w:t>
+      </w:r>
+      <w:r>
+        <w:rPr>
+          <w:rFonts w:hint="default"/>
+          <w:bCs/>
+          <w:szCs w:val="24"/>
+        </w:rPr>
+        <w:t xml:space="preserve"> de componentes que permitem processar e registrar os alertas recebidos, assegurando confiabilidade e consistência dos dados.</w:t>
       </w:r>
     </w:p>
     <w:p>
@@ -1524,192 +1798,116 @@
         <w:pStyle w:val="34"/>
         <w:ind w:left="0"/>
         <w:rPr>
+          <w:rFonts w:hint="default"/>
+          <w:bCs/>
+          <w:szCs w:val="24"/>
+        </w:rPr>
+      </w:pPr>
+    </w:p>
+    <w:p>
+      <w:pPr>
+        <w:pStyle w:val="4"/>
+        <w:bidi w:val="0"/>
+        <w:rPr>
+          <w:rFonts w:hint="default"/>
+          <w:lang w:val="pt-BR"/>
+        </w:rPr>
+      </w:pPr>
+      <w:bookmarkStart w:id="22" w:name="_Toc31172"/>
+      <w:r>
+        <w:rPr>
+          <w:rFonts w:hint="default"/>
+          <w:lang w:val="pt-BR"/>
+        </w:rPr>
+        <w:t>1.2.2 Arquitetura</w:t>
+      </w:r>
+      <w:bookmarkEnd w:id="22"/>
+    </w:p>
+    <w:p>
+      <w:pPr>
+        <w:pStyle w:val="34"/>
+        <w:ind w:left="0"/>
+        <w:rPr>
+          <w:rFonts w:hint="default"/>
+          <w:bCs/>
+          <w:szCs w:val="24"/>
+          <w:lang w:val="pt-BR"/>
+        </w:rPr>
+      </w:pPr>
+      <w:r>
+        <w:rPr>
+          <w:rFonts w:hint="default"/>
+          <w:bCs/>
+          <w:szCs w:val="24"/>
+        </w:rPr>
+        <w:t>A aplicação segue o modelo cliente-servidor, onde o cliente (interface web) interage com o servidor que processa os alertas, registra informações e disponibiliza relatórios para os usuários (equipe de atendimento). Todo o sistema está configurado para rodar localmente, garantindo rapidez na recepção de alertas e segurança no manuseio de informações sensíveis.</w:t>
+      </w:r>
+      <w:r>
+        <w:rPr>
+          <w:rFonts w:hint="default"/>
+          <w:bCs/>
+          <w:szCs w:val="24"/>
+          <w:lang w:val="pt-BR"/>
+        </w:rPr>
+        <w:t xml:space="preserve"> </w:t>
+      </w:r>
+    </w:p>
+    <w:p>
+      <w:pPr>
+        <w:pStyle w:val="34"/>
+        <w:ind w:left="0"/>
+        <w:rPr>
+          <w:rFonts w:hint="default"/>
+          <w:bCs/>
+          <w:szCs w:val="24"/>
+          <w:lang w:val="pt-BR"/>
+        </w:rPr>
+      </w:pPr>
+    </w:p>
+    <w:p>
+      <w:pPr>
+        <w:pStyle w:val="34"/>
+        <w:ind w:left="0"/>
+        <w:rPr>
+          <w:bCs/>
+          <w:szCs w:val="24"/>
+        </w:rPr>
+      </w:pPr>
+      <w:r>
+        <w:rPr>
+          <w:bCs/>
+          <w:szCs w:val="24"/>
+        </w:rPr>
+        <w:t>A seguir o diagrama de sistemas distribuídos do projeto.</w:t>
+      </w:r>
+    </w:p>
+    <w:p>
+      <w:pPr>
+        <w:pStyle w:val="34"/>
+        <w:spacing w:after="0" w:line="240" w:lineRule="auto"/>
+        <w:ind w:left="0"/>
+        <w:rPr>
           <w:color w:val="0070C0"/>
         </w:rPr>
       </w:pPr>
-      <w:r>
-        <w:rPr>
-          <w:bCs/>
-          <w:szCs w:val="24"/>
+    </w:p>
+    <w:p>
+      <w:pPr>
+        <w:pStyle w:val="34"/>
+        <w:spacing w:after="0" w:line="240" w:lineRule="auto"/>
+        <w:ind w:left="0"/>
+        <w:rPr>
+          <w:color w:val="0070C0"/>
+        </w:rPr>
+      </w:pPr>
+      <w:r>
+        <w:rPr>
+          <w:sz w:val="22"/>
         </w:rPr>
         <mc:AlternateContent>
           <mc:Choice Requires="wps">
             <w:drawing>
-              <wp:anchor distT="0" distB="0" distL="114300" distR="114300" simplePos="0" relativeHeight="251659264" behindDoc="0" locked="0" layoutInCell="1" allowOverlap="1">
-                <wp:simplePos x="0" y="0"/>
-                <wp:positionH relativeFrom="column">
-                  <wp:posOffset>5670550</wp:posOffset>
-                </wp:positionH>
-                <wp:positionV relativeFrom="paragraph">
-                  <wp:posOffset>1379855</wp:posOffset>
-                </wp:positionV>
-                <wp:extent cx="77470" cy="45720"/>
-                <wp:effectExtent l="0" t="0" r="13970" b="0"/>
-                <wp:wrapNone/>
-                <wp:docPr id="7" name="Retângulo 7"/>
-                <wp:cNvGraphicFramePr/>
-                <a:graphic xmlns:a="http://schemas.openxmlformats.org/drawingml/2006/main">
-                  <a:graphicData uri="http://schemas.microsoft.com/office/word/2010/wordprocessingShape">
-                    <wps:wsp>
-                      <wps:cNvSpPr/>
-                      <wps:spPr>
-                        <a:xfrm>
-                          <a:off x="0" y="0"/>
-                          <a:ext cx="77190" cy="45719"/>
-                        </a:xfrm>
-                        <a:prstGeom prst="rect">
-                          <a:avLst/>
-                        </a:prstGeom>
-                        <a:solidFill>
-                          <a:schemeClr val="bg1">
-                            <a:lumMod val="95000"/>
-                          </a:schemeClr>
-                        </a:solidFill>
-                        <a:ln>
-                          <a:noFill/>
-                        </a:ln>
-                      </wps:spPr>
-                      <wps:style>
-                        <a:lnRef idx="2">
-                          <a:schemeClr val="accent1">
-                            <a:shade val="50000"/>
-                          </a:schemeClr>
-                        </a:lnRef>
-                        <a:fillRef idx="1">
-                          <a:schemeClr val="accent1"/>
-                        </a:fillRef>
-                        <a:effectRef idx="0">
-                          <a:schemeClr val="accent1"/>
-                        </a:effectRef>
-                        <a:fontRef idx="minor">
-                          <a:schemeClr val="lt1"/>
-                        </a:fontRef>
-                      </wps:style>
-                      <wps:bodyPr rot="0" spcFirstLastPara="0" vertOverflow="overflow" horzOverflow="overflow" vert="horz" wrap="square" lIns="91440" tIns="45720" rIns="91440" bIns="45720" numCol="1" spcCol="0" rtlCol="0" fromWordArt="0" anchor="ctr" anchorCtr="0" forceAA="0" compatLnSpc="1">
-                        <a:noAutofit/>
-                      </wps:bodyPr>
-                    </wps:wsp>
-                  </a:graphicData>
-                </a:graphic>
-              </wp:anchor>
-            </w:drawing>
-          </mc:Choice>
-          <mc:Fallback>
-            <w:pict>
-              <v:rect id="_x0000_s1026" o:spid="_x0000_s1026" o:spt="1" style="position:absolute;left:0pt;margin-left:446.5pt;margin-top:108.65pt;height:3.6pt;width:6.1pt;z-index:251659264;v-text-anchor:middle;mso-width-relative:page;mso-height-relative:page;" fillcolor="#F2F2F2 [3052]" filled="t" stroked="f" coordsize="21600,21600" o:gfxdata="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">
-                <v:fill on="t" focussize="0,0"/>
-                <v:stroke on="f" weight="2pt"/>
-                <v:imagedata o:title=""/>
-                <o:lock v:ext="edit" aspectratio="f"/>
-              </v:rect>
-            </w:pict>
-          </mc:Fallback>
-        </mc:AlternateContent>
-      </w:r>
-      <w:r>
-        <w:rPr>
-          <w:sz w:val="22"/>
-        </w:rPr>
-        <mc:AlternateContent>
-          <mc:Choice Requires="wps">
-            <w:drawing>
-              <wp:anchor distT="0" distB="0" distL="114300" distR="114300" simplePos="0" relativeHeight="251670528" behindDoc="0" locked="0" layoutInCell="1" allowOverlap="1">
-                <wp:simplePos x="0" y="0"/>
-                <wp:positionH relativeFrom="column">
-                  <wp:posOffset>4660900</wp:posOffset>
-                </wp:positionH>
-                <wp:positionV relativeFrom="paragraph">
-                  <wp:posOffset>45720</wp:posOffset>
-                </wp:positionV>
-                <wp:extent cx="1592580" cy="278765"/>
-                <wp:effectExtent l="4445" t="4445" r="18415" b="6350"/>
-                <wp:wrapNone/>
-                <wp:docPr id="33" name="Caixa de Texto 33"/>
-                <wp:cNvGraphicFramePr/>
-                <a:graphic xmlns:a="http://schemas.openxmlformats.org/drawingml/2006/main">
-                  <a:graphicData uri="http://schemas.microsoft.com/office/word/2010/wordprocessingShape">
-                    <wps:wsp>
-                      <wps:cNvSpPr txBox="1"/>
-                      <wps:spPr>
-                        <a:xfrm>
-                          <a:off x="0" y="0"/>
-                          <a:ext cx="1592580" cy="278765"/>
-                        </a:xfrm>
-                        <a:prstGeom prst="rect">
-                          <a:avLst/>
-                        </a:prstGeom>
-                        <a:solidFill>
-                          <a:schemeClr val="lt1"/>
-                        </a:solidFill>
-                        <a:ln w="6350">
-                          <a:solidFill>
-                            <a:schemeClr val="bg1"/>
-                          </a:solidFill>
-                        </a:ln>
-                      </wps:spPr>
-                      <wps:style>
-                        <a:lnRef idx="0">
-                          <a:schemeClr val="accent1"/>
-                        </a:lnRef>
-                        <a:fillRef idx="0">
-                          <a:schemeClr val="accent1"/>
-                        </a:fillRef>
-                        <a:effectRef idx="0">
-                          <a:schemeClr val="accent1"/>
-                        </a:effectRef>
-                        <a:fontRef idx="minor">
-                          <a:schemeClr val="dk1"/>
-                        </a:fontRef>
-                      </wps:style>
-                      <wps:txbx>
-                        <w:txbxContent>
-                          <w:p/>
-                        </w:txbxContent>
-                      </wps:txbx>
-                      <wps:bodyPr rot="0" spcFirstLastPara="0" vertOverflow="overflow" horzOverflow="overflow" vert="horz" wrap="square" lIns="91440" tIns="45720" rIns="91440" bIns="45720" numCol="1" spcCol="0" rtlCol="0" fromWordArt="0" anchor="t" anchorCtr="0" forceAA="0" compatLnSpc="1">
-                        <a:noAutofit/>
-                      </wps:bodyPr>
-                    </wps:wsp>
-                  </a:graphicData>
-                </a:graphic>
-              </wp:anchor>
-            </w:drawing>
-          </mc:Choice>
-          <mc:Fallback>
-            <w:pict>
-              <v:shape id="_x0000_s1026" o:spid="_x0000_s1026" o:spt="202" type="#_x0000_t202" style="position:absolute;left:0pt;margin-left:367pt;margin-top:3.6pt;height:21.95pt;width:125.4pt;z-index:251670528;mso-width-relative:page;mso-height-relative:page;" fillcolor="#FFFFFF [3201]" filled="t" stroked="t" coordsize="21600,21600" o:gfxdata="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">
-                <v:fill on="t" focussize="0,0"/>
-                <v:stroke weight="0.5pt" color="#FFFFFF [3212]" joinstyle="round"/>
-                <v:imagedata o:title=""/>
-                <o:lock v:ext="edit" aspectratio="f"/>
-                <v:textbox>
-                  <w:txbxContent>
-                    <w:p/>
-                  </w:txbxContent>
-                </v:textbox>
-              </v:shape>
-            </w:pict>
-          </mc:Fallback>
-        </mc:AlternateContent>
-      </w:r>
-    </w:p>
-    <w:p>
-      <w:pPr>
-        <w:pStyle w:val="34"/>
-        <w:spacing w:after="0" w:line="240" w:lineRule="auto"/>
-        <w:ind w:left="0"/>
-        <w:rPr>
-          <w:color w:val="0070C0"/>
-        </w:rPr>
-      </w:pPr>
-      <w:r>
-        <w:rPr>
-          <w:sz w:val="22"/>
-        </w:rPr>
-        <mc:AlternateContent>
-          <mc:Choice Requires="wps">
-            <w:drawing>
-              <wp:anchor distT="0" distB="0" distL="114300" distR="114300" simplePos="0" relativeHeight="251713536" behindDoc="0" locked="0" layoutInCell="1" allowOverlap="1">
+              <wp:anchor distT="0" distB="0" distL="114300" distR="114300" simplePos="0" relativeHeight="251711488" behindDoc="0" locked="0" layoutInCell="1" allowOverlap="1">
                 <wp:simplePos x="0" y="0"/>
                 <wp:positionH relativeFrom="column">
                   <wp:posOffset>3031490</wp:posOffset>
@@ -1815,7 +2013,7 @@
           </mc:Choice>
           <mc:Fallback>
             <w:pict>
-              <v:shape id="_x0000_s1026" o:spid="_x0000_s1026" o:spt="202" type="#_x0000_t202" style="position:absolute;left:0pt;margin-left:238.7pt;margin-top:6.4pt;height:22.3pt;width:95.05pt;z-index:251713536;mso-width-relative:page;mso-height-relative:page;" fillcolor="#FFFFFF [3201]" filled="t" stroked="t" coordsize="21600,21600" o:gfxdata="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">
+              <v:shape id="_x0000_s1026" o:spid="_x0000_s1026" o:spt="202" type="#_x0000_t202" style="position:absolute;left:0pt;margin-left:238.7pt;margin-top:6.4pt;height:22.3pt;width:95.05pt;z-index:251711488;mso-width-relative:page;mso-height-relative:page;" fillcolor="#FFFFFF [3201]" filled="t" stroked="t" coordsize="21600,21600" o:gfxdata="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">
                 <v:fill on="t" focussize="0,0"/>
                 <v:stroke weight="0.5pt" color="#FFFFFF [3212]" joinstyle="round"/>
                 <v:imagedata o:title=""/>
@@ -1889,7 +2087,7 @@
         <mc:AlternateContent>
           <mc:Choice Requires="wps">
             <w:drawing>
-              <wp:anchor distT="0" distB="0" distL="114300" distR="114300" simplePos="0" relativeHeight="251706368" behindDoc="0" locked="0" layoutInCell="1" allowOverlap="1">
+              <wp:anchor distT="0" distB="0" distL="114300" distR="114300" simplePos="0" relativeHeight="251704320" behindDoc="0" locked="0" layoutInCell="1" allowOverlap="1">
                 <wp:simplePos x="0" y="0"/>
                 <wp:positionH relativeFrom="column">
                   <wp:posOffset>2443480</wp:posOffset>
@@ -1950,7 +2148,7 @@
           </mc:Choice>
           <mc:Fallback>
             <w:pict>
-              <v:shape id="_x0000_s1026" o:spid="_x0000_s1026" o:spt="3" type="#_x0000_t3" style="position:absolute;left:0pt;margin-left:192.4pt;margin-top:9.3pt;height:51.5pt;width:52pt;z-index:251706368;v-text-anchor:middle;mso-width-relative:page;mso-height-relative:page;" fillcolor="#FFFFFF [3212]" filled="t" stroked="t" coordsize="21600,21600" o:gfxdata="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">
+              <v:shape id="_x0000_s1026" o:spid="_x0000_s1026" o:spt="3" type="#_x0000_t3" style="position:absolute;left:0pt;margin-left:192.4pt;margin-top:9.3pt;height:51.5pt;width:52pt;z-index:251704320;v-text-anchor:middle;mso-width-relative:page;mso-height-relative:page;" fillcolor="#FFFFFF [3212]" filled="t" stroked="t" coordsize="21600,21600" o:gfxdata="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">
                 <v:fill on="t" focussize="0,0"/>
                 <v:stroke weight="2pt" color="#000000 [3213]" joinstyle="round"/>
                 <v:imagedata o:title=""/>
@@ -1967,7 +2165,7 @@
         <mc:AlternateContent>
           <mc:Choice Requires="wps">
             <w:drawing>
-              <wp:anchor distT="0" distB="0" distL="114300" distR="114300" simplePos="0" relativeHeight="251710464" behindDoc="0" locked="0" layoutInCell="1" allowOverlap="1">
+              <wp:anchor distT="0" distB="0" distL="114300" distR="114300" simplePos="0" relativeHeight="251708416" behindDoc="0" locked="0" layoutInCell="1" allowOverlap="1">
                 <wp:simplePos x="0" y="0"/>
                 <wp:positionH relativeFrom="column">
                   <wp:posOffset>2778760</wp:posOffset>
@@ -2021,7 +2219,7 @@
           </mc:Choice>
           <mc:Fallback>
             <w:pict>
-              <v:line id="_x0000_s1026" o:spid="_x0000_s1026" o:spt="20" style="position:absolute;left:0pt;flip:x y;margin-left:218.8pt;margin-top:10.8pt;height:15.25pt;width:0.1pt;z-index:251710464;mso-width-relative:page;mso-height-relative:page;" filled="f" stroked="t" coordsize="21600,21600" o:gfxdata="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">
+              <v:line id="_x0000_s1026" o:spid="_x0000_s1026" o:spt="20" style="position:absolute;left:0pt;flip:x y;margin-left:218.8pt;margin-top:10.8pt;height:15.25pt;width:0.1pt;z-index:251708416;mso-width-relative:page;mso-height-relative:page;" filled="f" stroked="t" coordsize="21600,21600" o:gfxdata="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">
                 <v:fill on="f" focussize="0,0"/>
                 <v:stroke weight="2pt" color="#000000 [3213]" joinstyle="round"/>
                 <v:imagedata o:title=""/>
@@ -2048,7 +2246,7 @@
         <mc:AlternateContent>
           <mc:Choice Requires="wps">
             <w:drawing>
-              <wp:anchor distT="0" distB="0" distL="114300" distR="114300" simplePos="0" relativeHeight="251707392" behindDoc="0" locked="0" layoutInCell="1" allowOverlap="1">
+              <wp:anchor distT="0" distB="0" distL="114300" distR="114300" simplePos="0" relativeHeight="251705344" behindDoc="0" locked="0" layoutInCell="1" allowOverlap="1">
                 <wp:simplePos x="0" y="0"/>
                 <wp:positionH relativeFrom="column">
                   <wp:posOffset>2604770</wp:posOffset>
@@ -2109,7 +2307,7 @@
           </mc:Choice>
           <mc:Fallback>
             <w:pict>
-              <v:rect id="_x0000_s1026" o:spid="_x0000_s1026" o:spt="1" style="position:absolute;left:0pt;margin-left:205.1pt;margin-top:11.1pt;height:20.75pt;width:26.8pt;z-index:251707392;v-text-anchor:middle;mso-width-relative:page;mso-height-relative:page;" fillcolor="#FFFFFF [3212]" filled="t" stroked="t" coordsize="21600,21600" o:gfxdata="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">
+              <v:rect id="_x0000_s1026" o:spid="_x0000_s1026" o:spt="1" style="position:absolute;left:0pt;margin-left:205.1pt;margin-top:11.1pt;height:20.75pt;width:26.8pt;z-index:251705344;v-text-anchor:middle;mso-width-relative:page;mso-height-relative:page;" fillcolor="#FFFFFF [3212]" filled="t" stroked="t" coordsize="21600,21600" o:gfxdata="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">
                 <v:fill on="t" focussize="0,0"/>
                 <v:stroke weight="2pt" color="#000000 [3213]" joinstyle="round"/>
                 <v:imagedata o:title=""/>
@@ -2146,7 +2344,7 @@
         <mc:AlternateContent>
           <mc:Choice Requires="wps">
             <w:drawing>
-              <wp:anchor distT="0" distB="0" distL="114300" distR="114300" simplePos="0" relativeHeight="251708416" behindDoc="0" locked="0" layoutInCell="1" allowOverlap="1">
+              <wp:anchor distT="0" distB="0" distL="114300" distR="114300" simplePos="0" relativeHeight="251706368" behindDoc="0" locked="0" layoutInCell="1" allowOverlap="1">
                 <wp:simplePos x="0" y="0"/>
                 <wp:positionH relativeFrom="column">
                   <wp:posOffset>2540000</wp:posOffset>
@@ -2200,7 +2398,7 @@
           </mc:Choice>
           <mc:Fallback>
             <w:pict>
-              <v:line id="_x0000_s1026" o:spid="_x0000_s1026" o:spt="20" style="position:absolute;left:0pt;flip:y;margin-left:200pt;margin-top:4.35pt;height:8.6pt;width:5.15pt;z-index:251708416;mso-width-relative:page;mso-height-relative:page;" filled="f" stroked="t" coordsize="21600,21600" o:gfxdata="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">
+              <v:line id="_x0000_s1026" o:spid="_x0000_s1026" o:spt="20" style="position:absolute;left:0pt;flip:y;margin-left:200pt;margin-top:4.35pt;height:8.6pt;width:5.15pt;z-index:251706368;mso-width-relative:page;mso-height-relative:page;" filled="f" stroked="t" coordsize="21600,21600" o:gfxdata="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">
                 <v:fill on="f" focussize="0,0"/>
                 <v:stroke weight="2pt" color="#000000 [3213]" joinstyle="round"/>
                 <v:imagedata o:title=""/>
@@ -2217,7 +2415,7 @@
         <mc:AlternateContent>
           <mc:Choice Requires="wps">
             <w:drawing>
-              <wp:anchor distT="0" distB="0" distL="114300" distR="114300" simplePos="0" relativeHeight="251709440" behindDoc="0" locked="0" layoutInCell="1" allowOverlap="1">
+              <wp:anchor distT="0" distB="0" distL="114300" distR="114300" simplePos="0" relativeHeight="251707392" behindDoc="0" locked="0" layoutInCell="1" allowOverlap="1">
                 <wp:simplePos x="0" y="0"/>
                 <wp:positionH relativeFrom="column">
                   <wp:posOffset>2939415</wp:posOffset>
@@ -2271,7 +2469,7 @@
           </mc:Choice>
           <mc:Fallback>
             <w:pict>
-              <v:line id="_x0000_s1026" o:spid="_x0000_s1026" o:spt="20" style="position:absolute;left:0pt;flip:x y;margin-left:231.45pt;margin-top:4.8pt;height:8.15pt;width:5.35pt;z-index:251709440;mso-width-relative:page;mso-height-relative:page;" filled="f" stroked="t" coordsize="21600,21600" o:gfxdata="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">
+              <v:line id="_x0000_s1026" o:spid="_x0000_s1026" o:spt="20" style="position:absolute;left:0pt;flip:x y;margin-left:231.45pt;margin-top:4.8pt;height:8.15pt;width:5.35pt;z-index:251707392;mso-width-relative:page;mso-height-relative:page;" filled="f" stroked="t" coordsize="21600,21600" o:gfxdata="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">
                 <v:fill on="f" focussize="0,0"/>
                 <v:stroke weight="2pt" color="#000000 [3213]" joinstyle="round"/>
                 <v:imagedata o:title=""/>
@@ -2298,7 +2496,7 @@
         <mc:AlternateContent>
           <mc:Choice Requires="wps">
             <w:drawing>
-              <wp:anchor distT="0" distB="0" distL="114300" distR="114300" simplePos="0" relativeHeight="251712512" behindDoc="0" locked="0" layoutInCell="1" allowOverlap="1">
+              <wp:anchor distT="0" distB="0" distL="114300" distR="114300" simplePos="0" relativeHeight="251710464" behindDoc="0" locked="0" layoutInCell="1" allowOverlap="1">
                 <wp:simplePos x="0" y="0"/>
                 <wp:positionH relativeFrom="column">
                   <wp:posOffset>2874645</wp:posOffset>
@@ -2354,7 +2552,7 @@
           </mc:Choice>
           <mc:Fallback>
             <w:pict>
-              <v:line id="_x0000_s1026" o:spid="_x0000_s1026" o:spt="20" style="position:absolute;left:0pt;flip:y;margin-left:226.35pt;margin-top:4.15pt;height:63.65pt;width:1.05pt;z-index:251712512;mso-width-relative:page;mso-height-relative:page;" filled="f" stroked="t" coordsize="21600,21600" o:gfxdata="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">
+              <v:line id="_x0000_s1026" o:spid="_x0000_s1026" o:spt="20" style="position:absolute;left:0pt;flip:y;margin-left:226.35pt;margin-top:4.15pt;height:63.65pt;width:1.05pt;z-index:251710464;mso-width-relative:page;mso-height-relative:page;" filled="f" stroked="t" coordsize="21600,21600" o:gfxdata="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">
                 <v:fill on="f" focussize="0,0"/>
                 <v:stroke weight="0.5pt" color="#000000 [3213]" miterlimit="8" joinstyle="miter" dashstyle="dash"/>
                 <v:imagedata o:title=""/>
@@ -2371,7 +2569,7 @@
         <mc:AlternateContent>
           <mc:Choice Requires="wps">
             <w:drawing>
-              <wp:anchor distT="0" distB="0" distL="114300" distR="114300" simplePos="0" relativeHeight="251711488" behindDoc="0" locked="0" layoutInCell="1" allowOverlap="1">
+              <wp:anchor distT="0" distB="0" distL="114300" distR="114300" simplePos="0" relativeHeight="251709440" behindDoc="0" locked="0" layoutInCell="1" allowOverlap="1">
                 <wp:simplePos x="0" y="0"/>
                 <wp:positionH relativeFrom="column">
                   <wp:posOffset>2628265</wp:posOffset>
@@ -2425,7 +2623,7 @@
           </mc:Choice>
           <mc:Fallback>
             <w:pict>
-              <v:line id="_x0000_s1026" o:spid="_x0000_s1026" o:spt="20" style="position:absolute;left:0pt;flip:x y;margin-left:206.95pt;margin-top:2.75pt;height:64.8pt;width:0.05pt;z-index:251711488;mso-width-relative:page;mso-height-relative:page;" filled="f" stroked="t" coordsize="21600,21600" o:gfxdata="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">
+              <v:line id="_x0000_s1026" o:spid="_x0000_s1026" o:spt="20" style="position:absolute;left:0pt;flip:x y;margin-left:206.95pt;margin-top:2.75pt;height:64.8pt;width:0.05pt;z-index:251709440;mso-width-relative:page;mso-height-relative:page;" filled="f" stroked="t" coordsize="21600,21600" o:gfxdata="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">
                 <v:fill on="f" focussize="0,0"/>
                 <v:stroke weight="2pt" color="#000000 [3213]" joinstyle="round"/>
                 <v:imagedata o:title=""/>
@@ -2452,7 +2650,7 @@
         <mc:AlternateContent>
           <mc:Choice Requires="wps">
             <w:drawing>
-              <wp:anchor distT="0" distB="0" distL="114300" distR="114300" simplePos="0" relativeHeight="251668480" behindDoc="0" locked="0" layoutInCell="1" allowOverlap="1">
+              <wp:anchor distT="0" distB="0" distL="114300" distR="114300" simplePos="0" relativeHeight="251667456" behindDoc="0" locked="0" layoutInCell="1" allowOverlap="1">
                 <wp:simplePos x="0" y="0"/>
                 <wp:positionH relativeFrom="column">
                   <wp:posOffset>3080385</wp:posOffset>
@@ -2566,7 +2764,7 @@
           </mc:Choice>
           <mc:Fallback>
             <w:pict>
-              <v:shape id="_x0000_s1026" o:spid="_x0000_s1026" o:spt="202" type="#_x0000_t202" style="position:absolute;left:0pt;margin-left:242.55pt;margin-top:8.1pt;height:52.75pt;width:115.95pt;z-index:251668480;mso-width-relative:page;mso-height-relative:page;" fillcolor="#FFFFFF [3201]" filled="t" stroked="t" coordsize="21600,21600" o:gfxdata="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">
+              <v:shape id="_x0000_s1026" o:spid="_x0000_s1026" o:spt="202" type="#_x0000_t202" style="position:absolute;left:0pt;margin-left:242.55pt;margin-top:8.1pt;height:52.75pt;width:115.95pt;z-index:251667456;mso-width-relative:page;mso-height-relative:page;" fillcolor="#FFFFFF [3201]" filled="t" stroked="t" coordsize="21600,21600" o:gfxdata="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">
                 <v:fill on="t" focussize="0,0"/>
                 <v:stroke weight="0.5pt" color="#FFFFFF [3212]" joinstyle="round"/>
                 <v:imagedata o:title=""/>
@@ -2638,7 +2836,7 @@
         <mc:AlternateContent>
           <mc:Choice Requires="wps">
             <w:drawing>
-              <wp:anchor distT="0" distB="0" distL="114300" distR="114300" simplePos="0" relativeHeight="251684864" behindDoc="0" locked="0" layoutInCell="1" allowOverlap="1">
+              <wp:anchor distT="0" distB="0" distL="114300" distR="114300" simplePos="0" relativeHeight="251682816" behindDoc="0" locked="0" layoutInCell="1" allowOverlap="1">
                 <wp:simplePos x="0" y="0"/>
                 <wp:positionH relativeFrom="column">
                   <wp:posOffset>-850900</wp:posOffset>
@@ -2730,7 +2928,7 @@
           </mc:Choice>
           <mc:Fallback>
             <w:pict>
-              <v:shape id="_x0000_s1026" o:spid="_x0000_s1026" o:spt="202" type="#_x0000_t202" style="position:absolute;left:0pt;margin-left:-67pt;margin-top:10.3pt;height:34.3pt;width:118.5pt;z-index:251684864;mso-width-relative:page;mso-height-relative:page;" filled="f" stroked="t" coordsize="21600,21600" o:gfxdata="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">
+              <v:shape id="_x0000_s1026" o:spid="_x0000_s1026" o:spt="202" type="#_x0000_t202" style="position:absolute;left:0pt;margin-left:-67pt;margin-top:10.3pt;height:34.3pt;width:118.5pt;z-index:251682816;mso-width-relative:page;mso-height-relative:page;" filled="f" stroked="t" coordsize="21600,21600" o:gfxdata="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">
                 <v:fill on="f" focussize="0,0"/>
                 <v:stroke weight="0.5pt" color="#FFFFFF [3212]" joinstyle="round"/>
                 <v:imagedata o:title=""/>
@@ -2787,7 +2985,7 @@
       </w:pPr>
       <w:r>
         <w:drawing>
-          <wp:anchor distT="0" distB="0" distL="114300" distR="114300" simplePos="0" relativeHeight="251686912" behindDoc="0" locked="0" layoutInCell="1" allowOverlap="1">
+          <wp:anchor distT="0" distB="0" distL="114300" distR="114300" simplePos="0" relativeHeight="251684864" behindDoc="0" locked="0" layoutInCell="1" allowOverlap="1">
             <wp:simplePos x="0" y="0"/>
             <wp:positionH relativeFrom="column">
               <wp:posOffset>1113790</wp:posOffset>
@@ -2845,7 +3043,7 @@
         <mc:AlternateContent>
           <mc:Choice Requires="wps">
             <w:drawing>
-              <wp:anchor distT="0" distB="0" distL="114300" distR="114300" simplePos="0" relativeHeight="251666432" behindDoc="0" locked="0" layoutInCell="1" allowOverlap="1">
+              <wp:anchor distT="0" distB="0" distL="114300" distR="114300" simplePos="0" relativeHeight="251665408" behindDoc="0" locked="0" layoutInCell="1" allowOverlap="1">
                 <wp:simplePos x="0" y="0"/>
                 <wp:positionH relativeFrom="column">
                   <wp:posOffset>4721225</wp:posOffset>
@@ -2932,7 +3130,7 @@
           </mc:Choice>
           <mc:Fallback>
             <w:pict>
-              <v:shape id="_x0000_s1026" o:spid="_x0000_s1026" o:spt="202" type="#_x0000_t202" style="position:absolute;left:0pt;margin-left:371.75pt;margin-top:10.35pt;height:20.05pt;width:113.45pt;z-index:251666432;mso-width-relative:page;mso-height-relative:page;" fillcolor="#FFFFFF [3201]" filled="t" stroked="t" coordsize="21600,21600" o:gfxdata="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">
+              <v:shape id="_x0000_s1026" o:spid="_x0000_s1026" o:spt="202" type="#_x0000_t202" style="position:absolute;left:0pt;margin-left:371.75pt;margin-top:10.35pt;height:20.05pt;width:113.45pt;z-index:251665408;mso-width-relative:page;mso-height-relative:page;" fillcolor="#FFFFFF [3201]" filled="t" stroked="t" coordsize="21600,21600" o:gfxdata="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">
                 <v:fill on="t" focussize="0,0"/>
                 <v:stroke weight="0.5pt" color="#FFFFFF [3212]" joinstyle="round"/>
                 <v:imagedata o:title=""/>
@@ -2997,7 +3195,7 @@
         <mc:AlternateContent>
           <mc:Choice Requires="wps">
             <w:drawing>
-              <wp:anchor distT="0" distB="0" distL="114300" distR="114300" simplePos="0" relativeHeight="251705344" behindDoc="0" locked="0" layoutInCell="1" allowOverlap="1">
+              <wp:anchor distT="0" distB="0" distL="114300" distR="114300" simplePos="0" relativeHeight="251703296" behindDoc="0" locked="0" layoutInCell="1" allowOverlap="1">
                 <wp:simplePos x="0" y="0"/>
                 <wp:positionH relativeFrom="column">
                   <wp:posOffset>617220</wp:posOffset>
@@ -3086,7 +3284,7 @@
           </mc:Choice>
           <mc:Fallback>
             <w:pict>
-              <v:shape id="_x0000_s1026" o:spid="_x0000_s1026" o:spt="202" type="#_x0000_t202" style="position:absolute;left:0pt;margin-left:48.6pt;margin-top:0.6pt;height:32.3pt;width:134.8pt;z-index:251705344;mso-width-relative:page;mso-height-relative:page;" fillcolor="#FFFFFF [3201]" filled="t" stroked="t" coordsize="21600,21600" o:gfxdata="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">
+              <v:shape id="_x0000_s1026" o:spid="_x0000_s1026" o:spt="202" type="#_x0000_t202" style="position:absolute;left:0pt;margin-left:48.6pt;margin-top:0.6pt;height:32.3pt;width:134.8pt;z-index:251703296;mso-width-relative:page;mso-height-relative:page;" fillcolor="#FFFFFF [3201]" filled="t" stroked="t" coordsize="21600,21600" o:gfxdata="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">
                 <v:fill on="t" focussize="0,0"/>
                 <v:stroke weight="0.5pt" color="#FFFFFF [3212]" joinstyle="round"/>
                 <v:imagedata o:title=""/>
@@ -3133,7 +3331,7 @@
         <mc:AlternateContent>
           <mc:Choice Requires="wps">
             <w:drawing>
-              <wp:anchor distT="0" distB="0" distL="114300" distR="114300" simplePos="0" relativeHeight="251692032" behindDoc="0" locked="0" layoutInCell="1" allowOverlap="1">
+              <wp:anchor distT="0" distB="0" distL="114300" distR="114300" simplePos="0" relativeHeight="251689984" behindDoc="0" locked="0" layoutInCell="1" allowOverlap="1">
                 <wp:simplePos x="0" y="0"/>
                 <wp:positionH relativeFrom="column">
                   <wp:posOffset>2753995</wp:posOffset>
@@ -3189,7 +3387,7 @@
           </mc:Choice>
           <mc:Fallback>
             <w:pict>
-              <v:line id="_x0000_s1026" o:spid="_x0000_s1026" o:spt="20" style="position:absolute;left:0pt;flip:x y;margin-left:216.85pt;margin-top:10.95pt;height:15.25pt;width:0.1pt;z-index:251692032;mso-width-relative:page;mso-height-relative:page;" filled="f" stroked="t" coordsize="21600,21600" o:gfxdata="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">
+              <v:line id="_x0000_s1026" o:spid="_x0000_s1026" o:spt="20" style="position:absolute;left:0pt;flip:x y;margin-left:216.85pt;margin-top:10.95pt;height:15.25pt;width:0.1pt;z-index:251689984;mso-width-relative:page;mso-height-relative:page;" filled="f" stroked="t" coordsize="21600,21600" o:gfxdata="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">
                 <v:fill on="f" focussize="0,0"/>
                 <v:stroke weight="2pt" color="#000000 [3213]" joinstyle="round"/>
                 <v:imagedata o:title=""/>
@@ -3206,7 +3404,7 @@
         <mc:AlternateContent>
           <mc:Choice Requires="wps">
             <w:drawing>
-              <wp:anchor distT="0" distB="0" distL="114300" distR="114300" simplePos="0" relativeHeight="251660288" behindDoc="0" locked="0" layoutInCell="1" allowOverlap="1">
+              <wp:anchor distT="0" distB="0" distL="114300" distR="114300" simplePos="0" relativeHeight="251659264" behindDoc="0" locked="0" layoutInCell="1" allowOverlap="1">
                 <wp:simplePos x="0" y="0"/>
                 <wp:positionH relativeFrom="column">
                   <wp:posOffset>4771390</wp:posOffset>
@@ -3267,7 +3465,7 @@
           </mc:Choice>
           <mc:Fallback>
             <w:pict>
-              <v:rect id="_x0000_s1026" o:spid="_x0000_s1026" o:spt="1" style="position:absolute;left:0pt;margin-left:375.7pt;margin-top:9.65pt;height:60pt;width:43pt;z-index:251660288;v-text-anchor:middle;mso-width-relative:page;mso-height-relative:page;" fillcolor="#FFFFFF [3212]" filled="t" stroked="t" coordsize="21600,21600" o:gfxdata="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">
+              <v:rect id="_x0000_s1026" o:spid="_x0000_s1026" o:spt="1" style="position:absolute;left:0pt;margin-left:375.7pt;margin-top:9.65pt;height:60pt;width:43pt;z-index:251659264;v-text-anchor:middle;mso-width-relative:page;mso-height-relative:page;" fillcolor="#FFFFFF [3212]" filled="t" stroked="t" coordsize="21600,21600" o:gfxdata="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">
                 <v:fill on="t" focussize="0,0"/>
                 <v:stroke weight="2pt" color="#000000 [3213]" joinstyle="round"/>
                 <v:imagedata o:title=""/>
@@ -3284,7 +3482,7 @@
         <mc:AlternateContent>
           <mc:Choice Requires="wps">
             <w:drawing>
-              <wp:anchor distT="0" distB="0" distL="114300" distR="114300" simplePos="0" relativeHeight="251664384" behindDoc="0" locked="0" layoutInCell="1" allowOverlap="1">
+              <wp:anchor distT="0" distB="0" distL="114300" distR="114300" simplePos="0" relativeHeight="251663360" behindDoc="0" locked="0" layoutInCell="1" allowOverlap="1">
                 <wp:simplePos x="0" y="0"/>
                 <wp:positionH relativeFrom="column">
                   <wp:posOffset>2423795</wp:posOffset>
@@ -3345,7 +3543,7 @@
           </mc:Choice>
           <mc:Fallback>
             <w:pict>
-              <v:shape id="_x0000_s1026" o:spid="_x0000_s1026" o:spt="3" type="#_x0000_t3" style="position:absolute;left:0pt;margin-left:190.85pt;margin-top:10.95pt;height:51.5pt;width:52pt;z-index:251664384;v-text-anchor:middle;mso-width-relative:page;mso-height-relative:page;" fillcolor="#FFFFFF [3212]" filled="t" stroked="t" coordsize="21600,21600" o:gfxdata="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">
+              <v:shape id="_x0000_s1026" o:spid="_x0000_s1026" o:spt="3" type="#_x0000_t3" style="position:absolute;left:0pt;margin-left:190.85pt;margin-top:10.95pt;height:51.5pt;width:52pt;z-index:251663360;v-text-anchor:middle;mso-width-relative:page;mso-height-relative:page;" fillcolor="#FFFFFF [3212]" filled="t" stroked="t" coordsize="21600,21600" o:gfxdata="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">
                 <v:fill on="t" focussize="0,0"/>
                 <v:stroke weight="2pt" color="#000000 [3213]" joinstyle="round"/>
                 <v:imagedata o:title=""/>
@@ -3372,7 +3570,7 @@
         <mc:AlternateContent>
           <mc:Choice Requires="wps">
             <w:drawing>
-              <wp:anchor distT="0" distB="0" distL="114300" distR="114300" simplePos="0" relativeHeight="251681792" behindDoc="0" locked="0" layoutInCell="1" allowOverlap="1">
+              <wp:anchor distT="0" distB="0" distL="114300" distR="114300" simplePos="0" relativeHeight="251679744" behindDoc="0" locked="0" layoutInCell="1" allowOverlap="1">
                 <wp:simplePos x="0" y="0"/>
                 <wp:positionH relativeFrom="column">
                   <wp:posOffset>-424815</wp:posOffset>
@@ -3428,7 +3626,7 @@
           </mc:Choice>
           <mc:Fallback>
             <w:pict>
-              <v:rect id="_x0000_s1026" o:spid="_x0000_s1026" o:spt="1" style="position:absolute;left:0pt;margin-left:-33.45pt;margin-top:6.95pt;height:31.15pt;width:76.5pt;z-index:251681792;v-text-anchor:middle;mso-width-relative:page;mso-height-relative:page;" filled="f" stroked="t" coordsize="21600,21600" o:gfxdata="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">
+              <v:rect id="_x0000_s1026" o:spid="_x0000_s1026" o:spt="1" style="position:absolute;left:0pt;margin-left:-33.45pt;margin-top:6.95pt;height:31.15pt;width:76.5pt;z-index:251679744;v-text-anchor:middle;mso-width-relative:page;mso-height-relative:page;" filled="f" stroked="t" coordsize="21600,21600" o:gfxdata="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">
                 <v:fill on="f" focussize="0,0"/>
                 <v:stroke weight="2pt" color="#000000 [3213]" joinstyle="round"/>
                 <v:imagedata o:title=""/>
@@ -3445,7 +3643,7 @@
         <mc:AlternateContent>
           <mc:Choice Requires="wps">
             <w:drawing>
-              <wp:anchor distT="0" distB="0" distL="114300" distR="114300" simplePos="0" relativeHeight="251691008" behindDoc="0" locked="0" layoutInCell="1" allowOverlap="1">
+              <wp:anchor distT="0" distB="0" distL="114300" distR="114300" simplePos="0" relativeHeight="251688960" behindDoc="0" locked="0" layoutInCell="1" allowOverlap="1">
                 <wp:simplePos x="0" y="0"/>
                 <wp:positionH relativeFrom="column">
                   <wp:posOffset>2585085</wp:posOffset>
@@ -3506,7 +3704,7 @@
           </mc:Choice>
           <mc:Fallback>
             <w:pict>
-              <v:rect id="_x0000_s1026" o:spid="_x0000_s1026" o:spt="1" style="position:absolute;left:0pt;margin-left:203.55pt;margin-top:12.75pt;height:20.75pt;width:26.8pt;z-index:251691008;v-text-anchor:middle;mso-width-relative:page;mso-height-relative:page;" fillcolor="#FFFFFF [3212]" filled="t" stroked="t" coordsize="21600,21600" o:gfxdata="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">
+              <v:rect id="_x0000_s1026" o:spid="_x0000_s1026" o:spt="1" style="position:absolute;left:0pt;margin-left:203.55pt;margin-top:12.75pt;height:20.75pt;width:26.8pt;z-index:251688960;v-text-anchor:middle;mso-width-relative:page;mso-height-relative:page;" fillcolor="#FFFFFF [3212]" filled="t" stroked="t" coordsize="21600,21600" o:gfxdata="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">
                 <v:fill on="t" focussize="0,0"/>
                 <v:stroke weight="2pt" color="#000000 [3213]" joinstyle="round"/>
                 <v:imagedata o:title=""/>
@@ -3533,7 +3731,7 @@
         <mc:AlternateContent>
           <mc:Choice Requires="wps">
             <w:drawing>
-              <wp:anchor distT="0" distB="0" distL="114300" distR="114300" simplePos="0" relativeHeight="251685888" behindDoc="0" locked="0" layoutInCell="1" allowOverlap="1">
+              <wp:anchor distT="0" distB="0" distL="114300" distR="114300" simplePos="0" relativeHeight="251683840" behindDoc="0" locked="0" layoutInCell="1" allowOverlap="1">
                 <wp:simplePos x="0" y="0"/>
                 <wp:positionH relativeFrom="column">
                   <wp:posOffset>3084195</wp:posOffset>
@@ -3589,7 +3787,7 @@
           </mc:Choice>
           <mc:Fallback>
             <w:pict>
-              <v:line id="_x0000_s1026" o:spid="_x0000_s1026" o:spt="20" style="position:absolute;left:0pt;margin-left:242.85pt;margin-top:9.85pt;height:2.95pt;width:132.85pt;z-index:251685888;mso-width-relative:page;mso-height-relative:page;" filled="f" stroked="t" coordsize="21600,21600" o:gfxdata="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">
+              <v:line id="_x0000_s1026" o:spid="_x0000_s1026" o:spt="20" style="position:absolute;left:0pt;margin-left:242.85pt;margin-top:9.85pt;height:2.95pt;width:132.85pt;z-index:251683840;mso-width-relative:page;mso-height-relative:page;" filled="f" stroked="t" coordsize="21600,21600" o:gfxdata="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">
                 <v:fill on="f" focussize="0,0"/>
                 <v:stroke weight="0.5pt" color="#000000 [3213]" miterlimit="8" joinstyle="miter" dashstyle="dash"/>
                 <v:imagedata o:title=""/>
@@ -3606,7 +3804,7 @@
         <mc:AlternateContent>
           <mc:Choice Requires="wps">
             <w:drawing>
-              <wp:anchor distT="0" distB="0" distL="114300" distR="114300" simplePos="0" relativeHeight="251682816" behindDoc="0" locked="0" layoutInCell="1" allowOverlap="1">
+              <wp:anchor distT="0" distB="0" distL="114300" distR="114300" simplePos="0" relativeHeight="251680768" behindDoc="0" locked="0" layoutInCell="1" allowOverlap="1">
                 <wp:simplePos x="0" y="0"/>
                 <wp:positionH relativeFrom="column">
                   <wp:posOffset>546735</wp:posOffset>
@@ -3662,7 +3860,7 @@
           </mc:Choice>
           <mc:Fallback>
             <w:pict>
-              <v:line id="_x0000_s1026" o:spid="_x0000_s1026" o:spt="20" style="position:absolute;left:0pt;flip:x y;margin-left:43.05pt;margin-top:8.75pt;height:0.35pt;width:147.8pt;z-index:251682816;mso-width-relative:page;mso-height-relative:page;" filled="f" stroked="t" coordsize="21600,21600" o:gfxdata="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">
+              <v:line id="_x0000_s1026" o:spid="_x0000_s1026" o:spt="20" style="position:absolute;left:0pt;flip:x y;margin-left:43.05pt;margin-top:8.75pt;height:0.35pt;width:147.8pt;z-index:251680768;mso-width-relative:page;mso-height-relative:page;" filled="f" stroked="t" coordsize="21600,21600" o:gfxdata="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">
                 <v:fill on="f" focussize="0,0"/>
                 <v:stroke weight="0.5pt" color="#000000 [3213]" miterlimit="8" joinstyle="miter" dashstyle="dash"/>
                 <v:imagedata o:title=""/>
@@ -3689,7 +3887,7 @@
         <mc:AlternateContent>
           <mc:Choice Requires="wps">
             <w:drawing>
-              <wp:anchor distT="0" distB="0" distL="114300" distR="114300" simplePos="0" relativeHeight="251694080" behindDoc="0" locked="0" layoutInCell="1" allowOverlap="1">
+              <wp:anchor distT="0" distB="0" distL="114300" distR="114300" simplePos="0" relativeHeight="251692032" behindDoc="0" locked="0" layoutInCell="1" allowOverlap="1">
                 <wp:simplePos x="0" y="0"/>
                 <wp:positionH relativeFrom="column">
                   <wp:posOffset>2919730</wp:posOffset>
@@ -3743,7 +3941,7 @@
           </mc:Choice>
           <mc:Fallback>
             <w:pict>
-              <v:line id="_x0000_s1026" o:spid="_x0000_s1026" o:spt="20" style="position:absolute;left:0pt;flip:x y;margin-left:229.9pt;margin-top:6.45pt;height:8.15pt;width:5.35pt;z-index:251694080;mso-width-relative:page;mso-height-relative:page;" filled="f" stroked="t" coordsize="21600,21600" o:gfxdata="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">
+              <v:line id="_x0000_s1026" o:spid="_x0000_s1026" o:spt="20" style="position:absolute;left:0pt;flip:x y;margin-left:229.9pt;margin-top:6.45pt;height:8.15pt;width:5.35pt;z-index:251692032;mso-width-relative:page;mso-height-relative:page;" filled="f" stroked="t" coordsize="21600,21600" o:gfxdata="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">
                 <v:fill on="f" focussize="0,0"/>
                 <v:stroke weight="2pt" color="#000000 [3213]" joinstyle="round"/>
                 <v:imagedata o:title=""/>
@@ -3760,7 +3958,7 @@
         <mc:AlternateContent>
           <mc:Choice Requires="wps">
             <w:drawing>
-              <wp:anchor distT="0" distB="0" distL="114300" distR="114300" simplePos="0" relativeHeight="251693056" behindDoc="0" locked="0" layoutInCell="1" allowOverlap="1">
+              <wp:anchor distT="0" distB="0" distL="114300" distR="114300" simplePos="0" relativeHeight="251691008" behindDoc="0" locked="0" layoutInCell="1" allowOverlap="1">
                 <wp:simplePos x="0" y="0"/>
                 <wp:positionH relativeFrom="column">
                   <wp:posOffset>2520315</wp:posOffset>
@@ -3814,7 +4012,7 @@
           </mc:Choice>
           <mc:Fallback>
             <w:pict>
-              <v:line id="_x0000_s1026" o:spid="_x0000_s1026" o:spt="20" style="position:absolute;left:0pt;flip:y;margin-left:198.45pt;margin-top:6pt;height:8.6pt;width:5.15pt;z-index:251693056;mso-width-relative:page;mso-height-relative:page;" filled="f" stroked="t" coordsize="21600,21600" o:gfxdata="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">
+              <v:line id="_x0000_s1026" o:spid="_x0000_s1026" o:spt="20" style="position:absolute;left:0pt;flip:y;margin-left:198.45pt;margin-top:6pt;height:8.6pt;width:5.15pt;z-index:251691008;mso-width-relative:page;mso-height-relative:page;" filled="f" stroked="t" coordsize="21600,21600" o:gfxdata="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">
                 <v:fill on="f" focussize="0,0"/>
                 <v:stroke weight="2pt" color="#000000 [3213]" joinstyle="round"/>
                 <v:imagedata o:title=""/>
@@ -3841,7 +4039,7 @@
         <mc:AlternateContent>
           <mc:Choice Requires="wps">
             <w:drawing>
-              <wp:anchor distT="0" distB="0" distL="114300" distR="114300" simplePos="0" relativeHeight="251683840" behindDoc="0" locked="0" layoutInCell="1" allowOverlap="1">
+              <wp:anchor distT="0" distB="0" distL="114300" distR="114300" simplePos="0" relativeHeight="251681792" behindDoc="0" locked="0" layoutInCell="1" allowOverlap="1">
                 <wp:simplePos x="0" y="0"/>
                 <wp:positionH relativeFrom="column">
                   <wp:posOffset>-737870</wp:posOffset>
@@ -3912,7 +4110,7 @@
           </mc:Choice>
           <mc:Fallback>
             <w:pict>
-              <v:shape id="_x0000_s1026" o:spid="_x0000_s1026" o:spt="202" type="#_x0000_t202" style="position:absolute;left:0pt;flip:x;margin-left:-58.1pt;margin-top:2.9pt;height:6pt;width:14.75pt;z-index:251683840;mso-width-relative:page;mso-height-relative:page;" fillcolor="#FFFFFF [3201]" filled="t" stroked="t" coordsize="21600,21600" o:gfxdata="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">
+              <v:shape id="_x0000_s1026" o:spid="_x0000_s1026" o:spt="202" type="#_x0000_t202" style="position:absolute;left:0pt;flip:x;margin-left:-58.1pt;margin-top:2.9pt;height:6pt;width:14.75pt;z-index:251681792;mso-width-relative:page;mso-height-relative:page;" fillcolor="#FFFFFF [3201]" filled="t" stroked="t" coordsize="21600,21600" o:gfxdata="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">
                 <v:fill on="t" focussize="0,0"/>
                 <v:stroke weight="0.5pt" color="#FFFFFF [3212]" joinstyle="round"/>
                 <v:imagedata o:title=""/>
@@ -3951,7 +4149,7 @@
         <mc:AlternateContent>
           <mc:Choice Requires="wps">
             <w:drawing>
-              <wp:anchor distT="0" distB="0" distL="114300" distR="114300" simplePos="0" relativeHeight="251674624" behindDoc="0" locked="0" layoutInCell="1" allowOverlap="1">
+              <wp:anchor distT="0" distB="0" distL="114300" distR="114300" simplePos="0" relativeHeight="251672576" behindDoc="0" locked="0" layoutInCell="1" allowOverlap="1">
                 <wp:simplePos x="0" y="0"/>
                 <wp:positionH relativeFrom="column">
                   <wp:posOffset>5149215</wp:posOffset>
@@ -4007,7 +4205,7 @@
           </mc:Choice>
           <mc:Fallback>
             <w:pict>
-              <v:line id="_x0000_s1026" o:spid="_x0000_s1026" o:spt="20" style="position:absolute;left:0pt;flip:x y;margin-left:405.45pt;margin-top:3.25pt;height:31.9pt;width:0.4pt;z-index:251674624;mso-width-relative:page;mso-height-relative:page;" filled="f" stroked="t" coordsize="21600,21600" o:gfxdata="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">
+              <v:line id="_x0000_s1026" o:spid="_x0000_s1026" o:spt="20" style="position:absolute;left:0pt;flip:x y;margin-left:405.45pt;margin-top:3.25pt;height:31.9pt;width:0.4pt;z-index:251672576;mso-width-relative:page;mso-height-relative:page;" filled="f" stroked="t" coordsize="21600,21600" o:gfxdata="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">
                 <v:fill on="f" focussize="0,0"/>
                 <v:stroke weight="0.5pt" color="#000000 [3213]" miterlimit="8" joinstyle="miter" dashstyle="dash"/>
                 <v:imagedata o:title=""/>
@@ -4024,7 +4222,7 @@
         <mc:AlternateContent>
           <mc:Choice Requires="wps">
             <w:drawing>
-              <wp:anchor distT="0" distB="0" distL="114300" distR="114300" simplePos="0" relativeHeight="251673600" behindDoc="0" locked="0" layoutInCell="1" allowOverlap="1">
+              <wp:anchor distT="0" distB="0" distL="114300" distR="114300" simplePos="0" relativeHeight="251671552" behindDoc="0" locked="0" layoutInCell="1" allowOverlap="1">
                 <wp:simplePos x="0" y="0"/>
                 <wp:positionH relativeFrom="column">
                   <wp:posOffset>4958715</wp:posOffset>
@@ -4078,7 +4276,7 @@
           </mc:Choice>
           <mc:Fallback>
             <w:pict>
-              <v:line id="_x0000_s1026" o:spid="_x0000_s1026" o:spt="20" style="position:absolute;left:0pt;flip:y;margin-left:390.45pt;margin-top:3.25pt;height:31.9pt;width:0pt;z-index:251673600;mso-width-relative:page;mso-height-relative:page;" filled="f" stroked="t" coordsize="21600,21600" o:gfxdata="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">
+              <v:line id="_x0000_s1026" o:spid="_x0000_s1026" o:spt="20" style="position:absolute;left:0pt;flip:y;margin-left:390.45pt;margin-top:3.25pt;height:31.9pt;width:0pt;z-index:251671552;mso-width-relative:page;mso-height-relative:page;" filled="f" stroked="t" coordsize="21600,21600" o:gfxdata="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">
                 <v:fill on="f" focussize="0,0"/>
                 <v:stroke weight="2pt" color="#000000 [3213]" joinstyle="round"/>
                 <v:imagedata o:title=""/>
@@ -4098,8 +4296,6 @@
           <w:color w:val="0070C0"/>
         </w:rPr>
       </w:pPr>
-      <w:bookmarkStart w:id="22" w:name="_GoBack"/>
-      <w:bookmarkEnd w:id="22"/>
       <w:r>
         <w:rPr>
           <w:sz w:val="22"/>
@@ -4107,7 +4303,7 @@
         <mc:AlternateContent>
           <mc:Choice Requires="wps">
             <w:drawing>
-              <wp:anchor distT="0" distB="0" distL="114300" distR="114300" simplePos="0" relativeHeight="251667456" behindDoc="0" locked="0" layoutInCell="1" allowOverlap="1">
+              <wp:anchor distT="0" distB="0" distL="114300" distR="114300" simplePos="0" relativeHeight="251666432" behindDoc="0" locked="0" layoutInCell="1" allowOverlap="1">
                 <wp:simplePos x="0" y="0"/>
                 <wp:positionH relativeFrom="column">
                   <wp:posOffset>159385</wp:posOffset>
@@ -4225,7 +4421,7 @@
           </mc:Choice>
           <mc:Fallback>
             <w:pict>
-              <v:shape id="_x0000_s1026" o:spid="_x0000_s1026" o:spt="202" type="#_x0000_t202" style="position:absolute;left:0pt;margin-left:12.55pt;margin-top:9.7pt;height:34.25pt;width:143.8pt;z-index:251667456;mso-width-relative:page;mso-height-relative:page;" fillcolor="#FFFFFF [3201]" filled="t" stroked="t" coordsize="21600,21600" o:gfxdata="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">
+              <v:shape id="_x0000_s1026" o:spid="_x0000_s1026" o:spt="202" type="#_x0000_t202" style="position:absolute;left:0pt;margin-left:12.55pt;margin-top:9.7pt;height:34.25pt;width:143.8pt;z-index:251666432;mso-width-relative:page;mso-height-relative:page;" fillcolor="#FFFFFF [3201]" filled="t" stroked="t" coordsize="21600,21600" o:gfxdata="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">
                 <v:fill on="t" focussize="0,0"/>
                 <v:stroke weight="0.5pt" color="#FFFFFF [3212]" joinstyle="round"/>
                 <v:imagedata o:title=""/>
@@ -4301,7 +4497,7 @@
         <mc:AlternateContent>
           <mc:Choice Requires="wps">
             <w:drawing>
-              <wp:anchor distT="0" distB="0" distL="114300" distR="114300" simplePos="0" relativeHeight="251680768" behindDoc="0" locked="0" layoutInCell="1" allowOverlap="1">
+              <wp:anchor distT="0" distB="0" distL="114300" distR="114300" simplePos="0" relativeHeight="251678720" behindDoc="0" locked="0" layoutInCell="1" allowOverlap="1">
                 <wp:simplePos x="0" y="0"/>
                 <wp:positionH relativeFrom="column">
                   <wp:posOffset>2836545</wp:posOffset>
@@ -4357,7 +4553,7 @@
           </mc:Choice>
           <mc:Fallback>
             <w:pict>
-              <v:line id="_x0000_s1026" o:spid="_x0000_s1026" o:spt="20" style="position:absolute;left:0pt;flip:y;margin-left:223.35pt;margin-top:-20.25pt;height:63.65pt;width:1.05pt;z-index:251680768;mso-width-relative:page;mso-height-relative:page;" filled="f" stroked="t" coordsize="21600,21600" o:gfxdata="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">
+              <v:line id="_x0000_s1026" o:spid="_x0000_s1026" o:spt="20" style="position:absolute;left:0pt;flip:y;margin-left:223.35pt;margin-top:-20.25pt;height:63.65pt;width:1.05pt;z-index:251678720;mso-width-relative:page;mso-height-relative:page;" filled="f" stroked="t" coordsize="21600,21600" o:gfxdata="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">
                 <v:fill on="f" focussize="0,0"/>
                 <v:stroke weight="0.5pt" color="#000000 [3213]" miterlimit="8" joinstyle="miter" dashstyle="dash"/>
                 <v:imagedata o:title=""/>
@@ -4374,7 +4570,7 @@
         <mc:AlternateContent>
           <mc:Choice Requires="wps">
             <w:drawing>
-              <wp:anchor distT="0" distB="0" distL="114300" distR="114300" simplePos="0" relativeHeight="251679744" behindDoc="0" locked="0" layoutInCell="1" allowOverlap="1">
+              <wp:anchor distT="0" distB="0" distL="114300" distR="114300" simplePos="0" relativeHeight="251677696" behindDoc="0" locked="0" layoutInCell="1" allowOverlap="1">
                 <wp:simplePos x="0" y="0"/>
                 <wp:positionH relativeFrom="column">
                   <wp:posOffset>2644775</wp:posOffset>
@@ -4428,7 +4624,7 @@
           </mc:Choice>
           <mc:Fallback>
             <w:pict>
-              <v:line id="_x0000_s1026" o:spid="_x0000_s1026" o:spt="20" style="position:absolute;left:0pt;flip:x y;margin-left:208.25pt;margin-top:-22.55pt;height:64.8pt;width:0.05pt;z-index:251679744;mso-width-relative:page;mso-height-relative:page;" filled="f" stroked="t" coordsize="21600,21600" o:gfxdata="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">
+              <v:line id="_x0000_s1026" o:spid="_x0000_s1026" o:spt="20" style="position:absolute;left:0pt;flip:x y;margin-left:208.25pt;margin-top:-22.55pt;height:64.8pt;width:0.05pt;z-index:251677696;mso-width-relative:page;mso-height-relative:page;" filled="f" stroked="t" coordsize="21600,21600" o:gfxdata="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">
                 <v:fill on="f" focussize="0,0"/>
                 <v:stroke weight="2pt" color="#000000 [3213]" joinstyle="round"/>
                 <v:imagedata o:title=""/>
@@ -4455,7 +4651,7 @@
         <mc:AlternateContent>
           <mc:Choice Requires="wps">
             <w:drawing>
-              <wp:anchor distT="0" distB="0" distL="114300" distR="114300" simplePos="0" relativeHeight="251701248" behindDoc="0" locked="0" layoutInCell="1" allowOverlap="1">
+              <wp:anchor distT="0" distB="0" distL="114300" distR="114300" simplePos="0" relativeHeight="251699200" behindDoc="0" locked="0" layoutInCell="1" allowOverlap="1">
                 <wp:simplePos x="0" y="0"/>
                 <wp:positionH relativeFrom="column">
                   <wp:posOffset>5053965</wp:posOffset>
@@ -4509,7 +4705,7 @@
           </mc:Choice>
           <mc:Fallback>
             <w:pict>
-              <v:line id="_x0000_s1026" o:spid="_x0000_s1026" o:spt="20" style="position:absolute;left:0pt;margin-left:397.95pt;margin-top:7.6pt;height:16.45pt;width:0.85pt;z-index:251701248;mso-width-relative:page;mso-height-relative:page;" filled="f" stroked="t" coordsize="21600,21600" o:gfxdata="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">
+              <v:line id="_x0000_s1026" o:spid="_x0000_s1026" o:spt="20" style="position:absolute;left:0pt;margin-left:397.95pt;margin-top:7.6pt;height:16.45pt;width:0.85pt;z-index:251699200;mso-width-relative:page;mso-height-relative:page;" filled="f" stroked="t" coordsize="21600,21600" o:gfxdata="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">
                 <v:fill on="f" focussize="0,0"/>
                 <v:stroke weight="2pt" color="#000000 [3213]" joinstyle="round"/>
                 <v:imagedata o:title=""/>
@@ -4526,7 +4722,7 @@
         <mc:AlternateContent>
           <mc:Choice Requires="wps">
             <w:drawing>
-              <wp:anchor distT="0" distB="0" distL="114300" distR="114300" simplePos="0" relativeHeight="251661312" behindDoc="0" locked="0" layoutInCell="1" allowOverlap="1">
+              <wp:anchor distT="0" distB="0" distL="114300" distR="114300" simplePos="0" relativeHeight="251660288" behindDoc="0" locked="0" layoutInCell="1" allowOverlap="1">
                 <wp:simplePos x="0" y="0"/>
                 <wp:positionH relativeFrom="column">
                   <wp:posOffset>4723765</wp:posOffset>
@@ -4587,7 +4783,7 @@
           </mc:Choice>
           <mc:Fallback>
             <w:pict>
-              <v:shape id="_x0000_s1026" o:spid="_x0000_s1026" o:spt="3" type="#_x0000_t3" style="position:absolute;left:0pt;margin-left:371.95pt;margin-top:7.6pt;height:51.5pt;width:52pt;z-index:251661312;v-text-anchor:middle;mso-width-relative:page;mso-height-relative:page;" fillcolor="#FFFFFF [3212]" filled="t" stroked="t" coordsize="21600,21600" o:gfxdata="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">
+              <v:shape id="_x0000_s1026" o:spid="_x0000_s1026" o:spt="3" type="#_x0000_t3" style="position:absolute;left:0pt;margin-left:371.95pt;margin-top:7.6pt;height:51.5pt;width:52pt;z-index:251660288;v-text-anchor:middle;mso-width-relative:page;mso-height-relative:page;" fillcolor="#FFFFFF [3212]" filled="t" stroked="t" coordsize="21600,21600" o:gfxdata="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">
                 <v:fill on="t" focussize="0,0"/>
                 <v:stroke weight="2pt" color="#000000 [3213]" joinstyle="round"/>
                 <v:imagedata o:title=""/>
@@ -4614,7 +4810,7 @@
         <mc:AlternateContent>
           <mc:Choice Requires="wps">
             <w:drawing>
-              <wp:anchor distT="0" distB="0" distL="114300" distR="114300" simplePos="0" relativeHeight="251689984" behindDoc="0" locked="0" layoutInCell="1" allowOverlap="1">
+              <wp:anchor distT="0" distB="0" distL="114300" distR="114300" simplePos="0" relativeHeight="251687936" behindDoc="0" locked="0" layoutInCell="1" allowOverlap="1">
                 <wp:simplePos x="0" y="0"/>
                 <wp:positionH relativeFrom="column">
                   <wp:posOffset>4894580</wp:posOffset>
@@ -4675,7 +4871,7 @@
           </mc:Choice>
           <mc:Fallback>
             <w:pict>
-              <v:rect id="_x0000_s1026" o:spid="_x0000_s1026" o:spt="1" style="position:absolute;left:0pt;margin-left:385.4pt;margin-top:10.6pt;height:20.75pt;width:26.8pt;z-index:251689984;v-text-anchor:middle;mso-width-relative:page;mso-height-relative:page;" fillcolor="#FFFFFF [3212]" filled="t" stroked="t" coordsize="21600,21600" o:gfxdata="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">
+              <v:rect id="_x0000_s1026" o:spid="_x0000_s1026" o:spt="1" style="position:absolute;left:0pt;margin-left:385.4pt;margin-top:10.6pt;height:20.75pt;width:26.8pt;z-index:251687936;v-text-anchor:middle;mso-width-relative:page;mso-height-relative:page;" fillcolor="#FFFFFF [3212]" filled="t" stroked="t" coordsize="21600,21600" o:gfxdata="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">
                 <v:fill on="t" focussize="0,0"/>
                 <v:stroke weight="2pt" color="#000000 [3213]" joinstyle="round"/>
                 <v:imagedata o:title=""/>
@@ -4702,7 +4898,7 @@
         <mc:AlternateContent>
           <mc:Choice Requires="wps">
             <w:drawing>
-              <wp:anchor distT="0" distB="0" distL="114300" distR="114300" simplePos="0" relativeHeight="251700224" behindDoc="0" locked="0" layoutInCell="1" allowOverlap="1">
+              <wp:anchor distT="0" distB="0" distL="114300" distR="114300" simplePos="0" relativeHeight="251698176" behindDoc="0" locked="0" layoutInCell="1" allowOverlap="1">
                 <wp:simplePos x="0" y="0"/>
                 <wp:positionH relativeFrom="column">
                   <wp:posOffset>3857625</wp:posOffset>
@@ -4756,7 +4952,7 @@
           </mc:Choice>
           <mc:Fallback>
             <w:pict>
-              <v:line id="_x0000_s1026" o:spid="_x0000_s1026" o:spt="20" style="position:absolute;left:0pt;margin-left:303.75pt;margin-top:4.4pt;height:14.95pt;width:0pt;z-index:251700224;mso-width-relative:page;mso-height-relative:page;" filled="f" stroked="t" coordsize="21600,21600" o:gfxdata="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">
+              <v:line id="_x0000_s1026" o:spid="_x0000_s1026" o:spt="20" style="position:absolute;left:0pt;margin-left:303.75pt;margin-top:4.4pt;height:14.95pt;width:0pt;z-index:251698176;mso-width-relative:page;mso-height-relative:page;" filled="f" stroked="t" coordsize="21600,21600" o:gfxdata="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">
                 <v:fill on="f" focussize="0,0"/>
                 <v:stroke weight="2pt" color="#000000 [3213]" joinstyle="round"/>
                 <v:imagedata o:title=""/>
@@ -4773,7 +4969,7 @@
         <mc:AlternateContent>
           <mc:Choice Requires="wps">
             <w:drawing>
-              <wp:anchor distT="0" distB="0" distL="114300" distR="114300" simplePos="0" relativeHeight="251695104" behindDoc="0" locked="0" layoutInCell="1" allowOverlap="1">
+              <wp:anchor distT="0" distB="0" distL="114300" distR="114300" simplePos="0" relativeHeight="251693056" behindDoc="0" locked="0" layoutInCell="1" allowOverlap="1">
                 <wp:simplePos x="0" y="0"/>
                 <wp:positionH relativeFrom="column">
                   <wp:posOffset>903605</wp:posOffset>
@@ -4827,7 +5023,7 @@
           </mc:Choice>
           <mc:Fallback>
             <w:pict>
-              <v:line id="_x0000_s1026" o:spid="_x0000_s1026" o:spt="20" style="position:absolute;left:0pt;flip:y;margin-left:71.15pt;margin-top:6.7pt;height:14.95pt;width:0pt;z-index:251695104;mso-width-relative:page;mso-height-relative:page;" filled="f" stroked="t" coordsize="21600,21600" o:gfxdata="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">
+              <v:line id="_x0000_s1026" o:spid="_x0000_s1026" o:spt="20" style="position:absolute;left:0pt;flip:y;margin-left:71.15pt;margin-top:6.7pt;height:14.95pt;width:0pt;z-index:251693056;mso-width-relative:page;mso-height-relative:page;" filled="f" stroked="t" coordsize="21600,21600" o:gfxdata="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">
                 <v:fill on="f" focussize="0,0"/>
                 <v:stroke weight="2pt" color="#000000 [3213]" joinstyle="round"/>
                 <v:imagedata o:title=""/>
@@ -4844,7 +5040,7 @@
         <mc:AlternateContent>
           <mc:Choice Requires="wps">
             <w:drawing>
-              <wp:anchor distT="0" distB="0" distL="114300" distR="114300" simplePos="0" relativeHeight="251662336" behindDoc="0" locked="0" layoutInCell="1" allowOverlap="1">
+              <wp:anchor distT="0" distB="0" distL="114300" distR="114300" simplePos="0" relativeHeight="251661312" behindDoc="0" locked="0" layoutInCell="1" allowOverlap="1">
                 <wp:simplePos x="0" y="0"/>
                 <wp:positionH relativeFrom="column">
                   <wp:posOffset>573405</wp:posOffset>
@@ -4905,7 +5101,7 @@
           </mc:Choice>
           <mc:Fallback>
             <w:pict>
-              <v:shape id="_x0000_s1026" o:spid="_x0000_s1026" o:spt="3" type="#_x0000_t3" style="position:absolute;left:0pt;margin-left:45.15pt;margin-top:6.7pt;height:51.5pt;width:52pt;z-index:251662336;v-text-anchor:middle;mso-width-relative:page;mso-height-relative:page;" fillcolor="#FFFFFF [3212]" filled="t" stroked="t" coordsize="21600,21600" o:gfxdata="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">
+              <v:shape id="_x0000_s1026" o:spid="_x0000_s1026" o:spt="3" type="#_x0000_t3" style="position:absolute;left:0pt;margin-left:45.15pt;margin-top:6.7pt;height:51.5pt;width:52pt;z-index:251661312;v-text-anchor:middle;mso-width-relative:page;mso-height-relative:page;" fillcolor="#FFFFFF [3212]" filled="t" stroked="t" coordsize="21600,21600" o:gfxdata="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">
                 <v:fill on="t" focussize="0,0"/>
                 <v:stroke weight="2pt" color="#000000 [3213]" joinstyle="round"/>
                 <v:imagedata o:title=""/>
@@ -4922,7 +5118,7 @@
         <mc:AlternateContent>
           <mc:Choice Requires="wps">
             <w:drawing>
-              <wp:anchor distT="0" distB="0" distL="114300" distR="114300" simplePos="0" relativeHeight="251663360" behindDoc="0" locked="0" layoutInCell="1" allowOverlap="1">
+              <wp:anchor distT="0" distB="0" distL="114300" distR="114300" simplePos="0" relativeHeight="251662336" behindDoc="0" locked="0" layoutInCell="1" allowOverlap="1">
                 <wp:simplePos x="0" y="0"/>
                 <wp:positionH relativeFrom="column">
                   <wp:posOffset>3527425</wp:posOffset>
@@ -4983,7 +5179,7 @@
           </mc:Choice>
           <mc:Fallback>
             <w:pict>
-              <v:shape id="_x0000_s1026" o:spid="_x0000_s1026" o:spt="3" type="#_x0000_t3" style="position:absolute;left:0pt;margin-left:277.75pt;margin-top:4.4pt;height:51.5pt;width:52pt;z-index:251663360;v-text-anchor:middle;mso-width-relative:page;mso-height-relative:page;" fillcolor="#FFFFFF [3212]" filled="t" stroked="t" coordsize="21600,21600" o:gfxdata="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">
+              <v:shape id="_x0000_s1026" o:spid="_x0000_s1026" o:spt="3" type="#_x0000_t3" style="position:absolute;left:0pt;margin-left:277.75pt;margin-top:4.4pt;height:51.5pt;width:52pt;z-index:251662336;v-text-anchor:middle;mso-width-relative:page;mso-height-relative:page;" fillcolor="#FFFFFF [3212]" filled="t" stroked="t" coordsize="21600,21600" o:gfxdata="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">
                 <v:fill on="t" focussize="0,0"/>
                 <v:stroke weight="2pt" color="#000000 [3213]" joinstyle="round"/>
                 <v:imagedata o:title=""/>
@@ -5000,7 +5196,7 @@
         <mc:AlternateContent>
           <mc:Choice Requires="wps">
             <w:drawing>
-              <wp:anchor distT="0" distB="0" distL="114300" distR="114300" simplePos="0" relativeHeight="251671552" behindDoc="0" locked="0" layoutInCell="1" allowOverlap="1">
+              <wp:anchor distT="0" distB="0" distL="114300" distR="114300" simplePos="0" relativeHeight="251669504" behindDoc="0" locked="0" layoutInCell="1" allowOverlap="1">
                 <wp:simplePos x="0" y="0"/>
                 <wp:positionH relativeFrom="column">
                   <wp:posOffset>2492375</wp:posOffset>
@@ -5061,7 +5257,7 @@
           </mc:Choice>
           <mc:Fallback>
             <w:pict>
-              <v:rect id="_x0000_s1026" o:spid="_x0000_s1026" o:spt="1" style="position:absolute;left:0pt;margin-left:196.25pt;margin-top:2.6pt;height:60pt;width:43pt;z-index:251671552;v-text-anchor:middle;mso-width-relative:page;mso-height-relative:page;" fillcolor="#FFFFFF [3212]" filled="t" stroked="t" coordsize="21600,21600" o:gfxdata="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">
+              <v:rect id="_x0000_s1026" o:spid="_x0000_s1026" o:spt="1" style="position:absolute;left:0pt;margin-left:196.25pt;margin-top:2.6pt;height:60pt;width:43pt;z-index:251669504;v-text-anchor:middle;mso-width-relative:page;mso-height-relative:page;" fillcolor="#FFFFFF [3212]" filled="t" stroked="t" coordsize="21600,21600" o:gfxdata="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">
                 <v:fill on="t" focussize="0,0"/>
                 <v:stroke weight="2pt" color="#000000 [3213]" joinstyle="round"/>
                 <v:imagedata o:title=""/>
@@ -5088,7 +5284,7 @@
         <mc:AlternateContent>
           <mc:Choice Requires="wps">
             <w:drawing>
-              <wp:anchor distT="0" distB="0" distL="114300" distR="114300" simplePos="0" relativeHeight="251704320" behindDoc="0" locked="0" layoutInCell="1" allowOverlap="1">
+              <wp:anchor distT="0" distB="0" distL="114300" distR="114300" simplePos="0" relativeHeight="251702272" behindDoc="0" locked="0" layoutInCell="1" allowOverlap="1">
                 <wp:simplePos x="0" y="0"/>
                 <wp:positionH relativeFrom="column">
                   <wp:posOffset>-494665</wp:posOffset>
@@ -5159,7 +5355,7 @@
           </mc:Choice>
           <mc:Fallback>
             <w:pict>
-              <v:shape id="_x0000_s1026" o:spid="_x0000_s1026" o:spt="202" type="#_x0000_t202" style="position:absolute;left:0pt;margin-left:-38.95pt;margin-top:13.55pt;height:6pt;width:26.1pt;rotation:-3801088f;z-index:251704320;mso-width-relative:page;mso-height-relative:page;" fillcolor="#FFFFFF [3201]" filled="t" stroked="t" coordsize="21600,21600" o:gfxdata="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">
+              <v:shape id="_x0000_s1026" o:spid="_x0000_s1026" o:spt="202" type="#_x0000_t202" style="position:absolute;left:0pt;margin-left:-38.95pt;margin-top:13.55pt;height:6pt;width:26.1pt;rotation:-3801088f;z-index:251702272;mso-width-relative:page;mso-height-relative:page;" fillcolor="#FFFFFF [3201]" filled="t" stroked="t" coordsize="21600,21600" o:gfxdata="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">
                 <v:fill on="t" focussize="0,0"/>
                 <v:stroke weight="0.5pt" color="#FFFFFF [3212]" joinstyle="round"/>
                 <v:imagedata o:title=""/>
@@ -5188,7 +5384,7 @@
         <mc:AlternateContent>
           <mc:Choice Requires="wps">
             <w:drawing>
-              <wp:anchor distT="0" distB="0" distL="114300" distR="114300" simplePos="0" relativeHeight="251703296" behindDoc="0" locked="0" layoutInCell="1" allowOverlap="1">
+              <wp:anchor distT="0" distB="0" distL="114300" distR="114300" simplePos="0" relativeHeight="251701248" behindDoc="0" locked="0" layoutInCell="1" allowOverlap="1">
                 <wp:simplePos x="0" y="0"/>
                 <wp:positionH relativeFrom="column">
                   <wp:posOffset>5223510</wp:posOffset>
@@ -5242,7 +5438,7 @@
           </mc:Choice>
           <mc:Fallback>
             <w:pict>
-              <v:line id="_x0000_s1026" o:spid="_x0000_s1026" o:spt="20" style="position:absolute;left:0pt;margin-left:411.3pt;margin-top:4.3pt;height:6.95pt;width:5.05pt;z-index:251703296;mso-width-relative:page;mso-height-relative:page;" filled="f" stroked="t" coordsize="21600,21600" o:gfxdata="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">
+              <v:line id="_x0000_s1026" o:spid="_x0000_s1026" o:spt="20" style="position:absolute;left:0pt;margin-left:411.3pt;margin-top:4.3pt;height:6.95pt;width:5.05pt;z-index:251701248;mso-width-relative:page;mso-height-relative:page;" filled="f" stroked="t" coordsize="21600,21600" o:gfxdata="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">
                 <v:fill on="f" focussize="0,0"/>
                 <v:stroke weight="2pt" color="#000000 [3213]" joinstyle="round"/>
                 <v:imagedata o:title=""/>
@@ -5259,7 +5455,7 @@
         <mc:AlternateContent>
           <mc:Choice Requires="wps">
             <w:drawing>
-              <wp:anchor distT="0" distB="0" distL="114300" distR="114300" simplePos="0" relativeHeight="251702272" behindDoc="0" locked="0" layoutInCell="1" allowOverlap="1">
+              <wp:anchor distT="0" distB="0" distL="114300" distR="114300" simplePos="0" relativeHeight="251700224" behindDoc="0" locked="0" layoutInCell="1" allowOverlap="1">
                 <wp:simplePos x="0" y="0"/>
                 <wp:positionH relativeFrom="column">
                   <wp:posOffset>4820285</wp:posOffset>
@@ -5313,7 +5509,7 @@
           </mc:Choice>
           <mc:Fallback>
             <w:pict>
-              <v:line id="_x0000_s1026" o:spid="_x0000_s1026" o:spt="20" style="position:absolute;left:0pt;flip:x;margin-left:379.55pt;margin-top:3.35pt;height:7.9pt;width:6.35pt;z-index:251702272;mso-width-relative:page;mso-height-relative:page;" filled="f" stroked="t" coordsize="21600,21600" o:gfxdata="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">
+              <v:line id="_x0000_s1026" o:spid="_x0000_s1026" o:spt="20" style="position:absolute;left:0pt;flip:x;margin-left:379.55pt;margin-top:3.35pt;height:7.9pt;width:6.35pt;z-index:251700224;mso-width-relative:page;mso-height-relative:page;" filled="f" stroked="t" coordsize="21600,21600" o:gfxdata="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">
                 <v:fill on="f" focussize="0,0"/>
                 <v:stroke weight="2pt" color="#000000 [3213]" joinstyle="round"/>
                 <v:imagedata o:title=""/>
@@ -5330,7 +5526,7 @@
         <mc:AlternateContent>
           <mc:Choice Requires="wps">
             <w:drawing>
-              <wp:anchor distT="0" distB="0" distL="114300" distR="114300" simplePos="0" relativeHeight="251688960" behindDoc="0" locked="0" layoutInCell="1" allowOverlap="1">
+              <wp:anchor distT="0" distB="0" distL="114300" distR="114300" simplePos="0" relativeHeight="251686912" behindDoc="0" locked="0" layoutInCell="1" allowOverlap="1">
                 <wp:simplePos x="0" y="0"/>
                 <wp:positionH relativeFrom="column">
                   <wp:posOffset>3687445</wp:posOffset>
@@ -5391,7 +5587,7 @@
           </mc:Choice>
           <mc:Fallback>
             <w:pict>
-              <v:rect id="_x0000_s1026" o:spid="_x0000_s1026" o:spt="1" style="position:absolute;left:0pt;margin-left:290.35pt;margin-top:5.9pt;height:20.75pt;width:26.8pt;z-index:251688960;v-text-anchor:middle;mso-width-relative:page;mso-height-relative:page;" fillcolor="#FFFFFF [3212]" filled="t" stroked="t" coordsize="21600,21600" o:gfxdata="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">
+              <v:rect id="_x0000_s1026" o:spid="_x0000_s1026" o:spt="1" style="position:absolute;left:0pt;margin-left:290.35pt;margin-top:5.9pt;height:20.75pt;width:26.8pt;z-index:251686912;v-text-anchor:middle;mso-width-relative:page;mso-height-relative:page;" fillcolor="#FFFFFF [3212]" filled="t" stroked="t" coordsize="21600,21600" o:gfxdata="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">
                 <v:fill on="t" focussize="0,0"/>
                 <v:stroke weight="2pt" color="#000000 [3213]" joinstyle="round"/>
                 <v:imagedata o:title=""/>
@@ -5408,7 +5604,7 @@
         <mc:AlternateContent>
           <mc:Choice Requires="wps">
             <w:drawing>
-              <wp:anchor distT="0" distB="0" distL="114300" distR="114300" simplePos="0" relativeHeight="251687936" behindDoc="0" locked="0" layoutInCell="1" allowOverlap="1">
+              <wp:anchor distT="0" distB="0" distL="114300" distR="114300" simplePos="0" relativeHeight="251685888" behindDoc="0" locked="0" layoutInCell="1" allowOverlap="1">
                 <wp:simplePos x="0" y="0"/>
                 <wp:positionH relativeFrom="column">
                   <wp:posOffset>733425</wp:posOffset>
@@ -5469,7 +5665,7 @@
           </mc:Choice>
           <mc:Fallback>
             <w:pict>
-              <v:rect id="_x0000_s1026" o:spid="_x0000_s1026" o:spt="1" style="position:absolute;left:0pt;margin-left:57.75pt;margin-top:8.2pt;height:20.75pt;width:26.8pt;z-index:251687936;v-text-anchor:middle;mso-width-relative:page;mso-height-relative:page;" fillcolor="#FFFFFF [3212]" filled="t" stroked="t" coordsize="21600,21600" o:gfxdata="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">
+              <v:rect id="_x0000_s1026" o:spid="_x0000_s1026" o:spt="1" style="position:absolute;left:0pt;margin-left:57.75pt;margin-top:8.2pt;height:20.75pt;width:26.8pt;z-index:251685888;v-text-anchor:middle;mso-width-relative:page;mso-height-relative:page;" fillcolor="#FFFFFF [3212]" filled="t" stroked="t" coordsize="21600,21600" o:gfxdata="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">
                 <v:fill on="t" focussize="0,0"/>
                 <v:stroke weight="2pt" color="#000000 [3213]" joinstyle="round"/>
                 <v:imagedata o:title=""/>
@@ -5486,7 +5682,7 @@
         <mc:AlternateContent>
           <mc:Choice Requires="wps">
             <w:drawing>
-              <wp:anchor distT="0" distB="0" distL="114300" distR="114300" simplePos="0" relativeHeight="251676672" behindDoc="0" locked="0" layoutInCell="1" allowOverlap="1">
+              <wp:anchor distT="0" distB="0" distL="114300" distR="114300" simplePos="0" relativeHeight="251674624" behindDoc="0" locked="0" layoutInCell="1" allowOverlap="1">
                 <wp:simplePos x="0" y="0"/>
                 <wp:positionH relativeFrom="column">
                   <wp:posOffset>3046095</wp:posOffset>
@@ -5542,7 +5738,7 @@
           </mc:Choice>
           <mc:Fallback>
             <w:pict>
-              <v:line id="_x0000_s1026" o:spid="_x0000_s1026" o:spt="20" style="position:absolute;left:0pt;flip:x;margin-left:239.85pt;margin-top:8.65pt;height:0.35pt;width:38.65pt;z-index:251676672;mso-width-relative:page;mso-height-relative:page;" filled="f" stroked="t" coordsize="21600,21600" o:gfxdata="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">
+              <v:line id="_x0000_s1026" o:spid="_x0000_s1026" o:spt="20" style="position:absolute;left:0pt;flip:x;margin-left:239.85pt;margin-top:8.65pt;height:0.35pt;width:38.65pt;z-index:251674624;mso-width-relative:page;mso-height-relative:page;" filled="f" stroked="t" coordsize="21600,21600" o:gfxdata="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">
                 <v:fill on="f" focussize="0,0"/>
                 <v:stroke weight="0.5pt" color="#000000 [3213]" miterlimit="8" joinstyle="miter" dashstyle="dash"/>
                 <v:imagedata o:title=""/>
@@ -5569,7 +5765,7 @@
         <mc:AlternateContent>
           <mc:Choice Requires="wps">
             <w:drawing>
-              <wp:anchor distT="0" distB="0" distL="114300" distR="114300" simplePos="0" relativeHeight="251698176" behindDoc="0" locked="0" layoutInCell="1" allowOverlap="1">
+              <wp:anchor distT="0" distB="0" distL="114300" distR="114300" simplePos="0" relativeHeight="251696128" behindDoc="0" locked="0" layoutInCell="1" allowOverlap="1">
                 <wp:simplePos x="0" y="0"/>
                 <wp:positionH relativeFrom="column">
                   <wp:posOffset>4027805</wp:posOffset>
@@ -5623,7 +5819,7 @@
           </mc:Choice>
           <mc:Fallback>
             <w:pict>
-              <v:line id="_x0000_s1026" o:spid="_x0000_s1026" o:spt="20" style="position:absolute;left:0pt;margin-left:317.15pt;margin-top:13.05pt;height:8.45pt;width:5pt;z-index:251698176;mso-width-relative:page;mso-height-relative:page;" filled="f" stroked="t" coordsize="21600,21600" o:gfxdata="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">
+              <v:line id="_x0000_s1026" o:spid="_x0000_s1026" o:spt="20" style="position:absolute;left:0pt;margin-left:317.15pt;margin-top:13.05pt;height:8.45pt;width:5pt;z-index:251696128;mso-width-relative:page;mso-height-relative:page;" filled="f" stroked="t" coordsize="21600,21600" o:gfxdata="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">
                 <v:fill on="f" focussize="0,0"/>
                 <v:stroke weight="2pt" color="#000000 [3213]" joinstyle="round"/>
                 <v:imagedata o:title=""/>
@@ -5640,7 +5836,7 @@
         <mc:AlternateContent>
           <mc:Choice Requires="wps">
             <w:drawing>
-              <wp:anchor distT="0" distB="0" distL="114300" distR="114300" simplePos="0" relativeHeight="251665408" behindDoc="0" locked="0" layoutInCell="1" allowOverlap="1">
+              <wp:anchor distT="0" distB="0" distL="114300" distR="114300" simplePos="0" relativeHeight="251664384" behindDoc="0" locked="0" layoutInCell="1" allowOverlap="1">
                 <wp:simplePos x="0" y="0"/>
                 <wp:positionH relativeFrom="column">
                   <wp:posOffset>4772025</wp:posOffset>
@@ -5734,7 +5930,7 @@
           </mc:Choice>
           <mc:Fallback>
             <w:pict>
-              <v:shape id="_x0000_s1026" o:spid="_x0000_s1026" o:spt="202" type="#_x0000_t202" style="position:absolute;left:0pt;margin-left:375.75pt;margin-top:7.35pt;height:40.1pt;width:122.5pt;z-index:251665408;mso-width-relative:page;mso-height-relative:page;" fillcolor="#FFFFFF [3201]" filled="t" stroked="t" coordsize="21600,21600" o:gfxdata="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">
+              <v:shape id="_x0000_s1026" o:spid="_x0000_s1026" o:spt="202" type="#_x0000_t202" style="position:absolute;left:0pt;margin-left:375.75pt;margin-top:7.35pt;height:40.1pt;width:122.5pt;z-index:251664384;mso-width-relative:page;mso-height-relative:page;" fillcolor="#FFFFFF [3201]" filled="t" stroked="t" coordsize="21600,21600" o:gfxdata="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">
                 <v:fill on="t" focussize="0,0"/>
                 <v:stroke weight="0.5pt" color="#FFFFFF [3212]" joinstyle="round"/>
                 <v:imagedata o:title=""/>
@@ -5786,7 +5982,7 @@
         <mc:AlternateContent>
           <mc:Choice Requires="wps">
             <w:drawing>
-              <wp:anchor distT="0" distB="0" distL="114300" distR="114300" simplePos="0" relativeHeight="251678720" behindDoc="0" locked="0" layoutInCell="1" allowOverlap="1">
+              <wp:anchor distT="0" distB="0" distL="114300" distR="114300" simplePos="0" relativeHeight="251676672" behindDoc="0" locked="0" layoutInCell="1" allowOverlap="1">
                 <wp:simplePos x="0" y="0"/>
                 <wp:positionH relativeFrom="column">
                   <wp:posOffset>1233805</wp:posOffset>
@@ -5842,7 +6038,7 @@
           </mc:Choice>
           <mc:Fallback>
             <w:pict>
-              <v:line id="_x0000_s1026" o:spid="_x0000_s1026" o:spt="20" style="position:absolute;left:0pt;flip:x y;margin-left:97.15pt;margin-top:5.6pt;height:0.15pt;width:99.1pt;z-index:251678720;mso-width-relative:page;mso-height-relative:page;" filled="f" stroked="t" coordsize="21600,21600" o:gfxdata="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">
+              <v:line id="_x0000_s1026" o:spid="_x0000_s1026" o:spt="20" style="position:absolute;left:0pt;flip:x y;margin-left:97.15pt;margin-top:5.6pt;height:0.15pt;width:99.1pt;z-index:251676672;mso-width-relative:page;mso-height-relative:page;" filled="f" stroked="t" coordsize="21600,21600" o:gfxdata="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">
                 <v:fill on="f" focussize="0,0"/>
                 <v:stroke weight="0.5pt" color="#000000 [3213]" miterlimit="8" joinstyle="miter" dashstyle="dash"/>
                 <v:imagedata o:title=""/>
@@ -5869,7 +6065,7 @@
         <mc:AlternateContent>
           <mc:Choice Requires="wps">
             <w:drawing>
-              <wp:anchor distT="0" distB="0" distL="114300" distR="114300" simplePos="0" relativeHeight="251699200" behindDoc="0" locked="0" layoutInCell="1" allowOverlap="1">
+              <wp:anchor distT="0" distB="0" distL="114300" distR="114300" simplePos="0" relativeHeight="251697152" behindDoc="0" locked="0" layoutInCell="1" allowOverlap="1">
                 <wp:simplePos x="0" y="0"/>
                 <wp:positionH relativeFrom="column">
                   <wp:posOffset>3623945</wp:posOffset>
@@ -5923,7 +6119,7 @@
           </mc:Choice>
           <mc:Fallback>
             <w:pict>
-              <v:line id="_x0000_s1026" o:spid="_x0000_s1026" o:spt="20" style="position:absolute;left:0pt;flip:x;margin-left:285.35pt;margin-top:0.05pt;height:8pt;width:5pt;z-index:251699200;mso-width-relative:page;mso-height-relative:page;" filled="f" stroked="t" coordsize="21600,21600" o:gfxdata="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">
+              <v:line id="_x0000_s1026" o:spid="_x0000_s1026" o:spt="20" style="position:absolute;left:0pt;flip:x;margin-left:285.35pt;margin-top:0.05pt;height:8pt;width:5pt;z-index:251697152;mso-width-relative:page;mso-height-relative:page;" filled="f" stroked="t" coordsize="21600,21600" o:gfxdata="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">
                 <v:fill on="f" focussize="0,0"/>
                 <v:stroke weight="2pt" color="#000000 [3213]" joinstyle="round"/>
                 <v:imagedata o:title=""/>
@@ -5940,7 +6136,7 @@
         <mc:AlternateContent>
           <mc:Choice Requires="wps">
             <w:drawing>
-              <wp:anchor distT="0" distB="0" distL="114300" distR="114300" simplePos="0" relativeHeight="251697152" behindDoc="0" locked="0" layoutInCell="1" allowOverlap="1">
+              <wp:anchor distT="0" distB="0" distL="114300" distR="114300" simplePos="0" relativeHeight="251695104" behindDoc="0" locked="0" layoutInCell="1" allowOverlap="1">
                 <wp:simplePos x="0" y="0"/>
                 <wp:positionH relativeFrom="column">
                   <wp:posOffset>1073785</wp:posOffset>
@@ -5994,7 +6190,7 @@
           </mc:Choice>
           <mc:Fallback>
             <w:pict>
-              <v:line id="_x0000_s1026" o:spid="_x0000_s1026" o:spt="20" style="position:absolute;left:0pt;margin-left:84.55pt;margin-top:2.35pt;height:8pt;width:5pt;z-index:251697152;mso-width-relative:page;mso-height-relative:page;" filled="f" stroked="t" coordsize="21600,21600" o:gfxdata="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">
+              <v:line id="_x0000_s1026" o:spid="_x0000_s1026" o:spt="20" style="position:absolute;left:0pt;margin-left:84.55pt;margin-top:2.35pt;height:8pt;width:5pt;z-index:251695104;mso-width-relative:page;mso-height-relative:page;" filled="f" stroked="t" coordsize="21600,21600" o:gfxdata="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">
                 <v:fill on="f" focussize="0,0"/>
                 <v:stroke weight="2pt" color="#000000 [3213]" joinstyle="round"/>
                 <v:imagedata o:title=""/>
@@ -6011,7 +6207,7 @@
         <mc:AlternateContent>
           <mc:Choice Requires="wps">
             <w:drawing>
-              <wp:anchor distT="0" distB="0" distL="114300" distR="114300" simplePos="0" relativeHeight="251696128" behindDoc="0" locked="0" layoutInCell="1" allowOverlap="1">
+              <wp:anchor distT="0" distB="0" distL="114300" distR="114300" simplePos="0" relativeHeight="251694080" behindDoc="0" locked="0" layoutInCell="1" allowOverlap="1">
                 <wp:simplePos x="0" y="0"/>
                 <wp:positionH relativeFrom="column">
                   <wp:posOffset>669925</wp:posOffset>
@@ -6065,7 +6261,7 @@
           </mc:Choice>
           <mc:Fallback>
             <w:pict>
-              <v:line id="_x0000_s1026" o:spid="_x0000_s1026" o:spt="20" style="position:absolute;left:0pt;flip:x;margin-left:52.75pt;margin-top:1pt;height:9.35pt;width:5pt;z-index:251696128;mso-width-relative:page;mso-height-relative:page;" filled="f" stroked="t" coordsize="21600,21600" o:gfxdata="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">
+              <v:line id="_x0000_s1026" o:spid="_x0000_s1026" o:spt="20" style="position:absolute;left:0pt;flip:x;margin-left:52.75pt;margin-top:1pt;height:9.35pt;width:5pt;z-index:251694080;mso-width-relative:page;mso-height-relative:page;" filled="f" stroked="t" coordsize="21600,21600" o:gfxdata="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">
                 <v:fill on="f" focussize="0,0"/>
                 <v:stroke weight="2pt" color="#000000 [3213]" joinstyle="round"/>
                 <v:imagedata o:title=""/>
@@ -6082,7 +6278,7 @@
         <mc:AlternateContent>
           <mc:Choice Requires="wps">
             <w:drawing>
-              <wp:anchor distT="0" distB="0" distL="114300" distR="114300" simplePos="0" relativeHeight="251677696" behindDoc="0" locked="0" layoutInCell="1" allowOverlap="1">
+              <wp:anchor distT="0" distB="0" distL="114300" distR="114300" simplePos="0" relativeHeight="251675648" behindDoc="0" locked="0" layoutInCell="1" allowOverlap="1">
                 <wp:simplePos x="0" y="0"/>
                 <wp:positionH relativeFrom="column">
                   <wp:posOffset>1137285</wp:posOffset>
@@ -6136,7 +6332,7 @@
           </mc:Choice>
           <mc:Fallback>
             <w:pict>
-              <v:line id="_x0000_s1026" o:spid="_x0000_s1026" o:spt="20" style="position:absolute;left:0pt;flip:x;margin-left:89.55pt;margin-top:8.85pt;height:1.55pt;width:106.6pt;z-index:251677696;mso-width-relative:page;mso-height-relative:page;" filled="f" stroked="t" coordsize="21600,21600" o:gfxdata="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">
+              <v:line id="_x0000_s1026" o:spid="_x0000_s1026" o:spt="20" style="position:absolute;left:0pt;flip:x;margin-left:89.55pt;margin-top:8.85pt;height:1.55pt;width:106.6pt;z-index:251675648;mso-width-relative:page;mso-height-relative:page;" filled="f" stroked="t" coordsize="21600,21600" o:gfxdata="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">
                 <v:fill on="f" focussize="0,0"/>
                 <v:stroke weight="2pt" color="#000000 [3213]" joinstyle="round"/>
                 <v:imagedata o:title=""/>
@@ -6153,7 +6349,7 @@
         <mc:AlternateContent>
           <mc:Choice Requires="wps">
             <w:drawing>
-              <wp:anchor distT="0" distB="0" distL="114300" distR="114300" simplePos="0" relativeHeight="251675648" behindDoc="0" locked="0" layoutInCell="1" allowOverlap="1">
+              <wp:anchor distT="0" distB="0" distL="114300" distR="114300" simplePos="0" relativeHeight="251673600" behindDoc="0" locked="0" layoutInCell="1" allowOverlap="1">
                 <wp:simplePos x="0" y="0"/>
                 <wp:positionH relativeFrom="column">
                   <wp:posOffset>3027045</wp:posOffset>
@@ -6207,7 +6403,7 @@
           </mc:Choice>
           <mc:Fallback>
             <w:pict>
-              <v:line id="_x0000_s1026" o:spid="_x0000_s1026" o:spt="20" style="position:absolute;left:0pt;flip:x;margin-left:238.35pt;margin-top:0.9pt;height:0pt;width:42pt;z-index:251675648;mso-width-relative:page;mso-height-relative:page;" filled="f" stroked="t" coordsize="21600,21600" o:gfxdata="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">
+              <v:line id="_x0000_s1026" o:spid="_x0000_s1026" o:spt="20" style="position:absolute;left:0pt;flip:x;margin-left:238.35pt;margin-top:0.9pt;height:0pt;width:42pt;z-index:251673600;mso-width-relative:page;mso-height-relative:page;" filled="f" stroked="t" coordsize="21600,21600" o:gfxdata="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">
                 <v:fill on="f" focussize="0,0"/>
                 <v:stroke weight="2pt" color="#000000 [3213]" joinstyle="round"/>
                 <v:imagedata o:title=""/>
@@ -6234,7 +6430,7 @@
         <mc:AlternateContent>
           <mc:Choice Requires="wps">
             <w:drawing>
-              <wp:anchor distT="0" distB="0" distL="114300" distR="114300" simplePos="0" relativeHeight="251669504" behindDoc="0" locked="0" layoutInCell="1" allowOverlap="1">
+              <wp:anchor distT="0" distB="0" distL="114300" distR="114300" simplePos="0" relativeHeight="251668480" behindDoc="0" locked="0" layoutInCell="1" allowOverlap="1">
                 <wp:simplePos x="0" y="0"/>
                 <wp:positionH relativeFrom="column">
                   <wp:posOffset>3326765</wp:posOffset>
@@ -6312,7 +6508,7 @@
           </mc:Choice>
           <mc:Fallback>
             <w:pict>
-              <v:shape id="_x0000_s1026" o:spid="_x0000_s1026" o:spt="202" type="#_x0000_t202" style="position:absolute;left:0pt;margin-left:261.95pt;margin-top:7.3pt;height:38.55pt;width:116pt;z-index:251669504;mso-width-relative:page;mso-height-relative:page;" fillcolor="#FFFFFF [3201]" filled="t" stroked="t" coordsize="21600,21600" o:gfxdata="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">
+              <v:shape id="_x0000_s1026" o:spid="_x0000_s1026" o:spt="202" type="#_x0000_t202" style="position:absolute;left:0pt;margin-left:261.95pt;margin-top:7.3pt;height:38.55pt;width:116pt;z-index:251668480;mso-width-relative:page;mso-height-relative:page;" fillcolor="#FFFFFF [3201]" filled="t" stroked="t" coordsize="21600,21600" o:gfxdata="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">
                 <v:fill on="t" focussize="0,0"/>
                 <v:stroke weight="0.5pt" color="#FFFFFF [3212]" joinstyle="round"/>
                 <v:imagedata o:title=""/>
@@ -6358,7 +6554,7 @@
         <mc:AlternateContent>
           <mc:Choice Requires="wps">
             <w:drawing>
-              <wp:anchor distT="0" distB="0" distL="114300" distR="114300" simplePos="0" relativeHeight="251672576" behindDoc="0" locked="0" layoutInCell="1" allowOverlap="1">
+              <wp:anchor distT="0" distB="0" distL="114300" distR="114300" simplePos="0" relativeHeight="251670528" behindDoc="0" locked="0" layoutInCell="1" allowOverlap="1">
                 <wp:simplePos x="0" y="0"/>
                 <wp:positionH relativeFrom="column">
                   <wp:posOffset>1940560</wp:posOffset>
@@ -6436,7 +6632,7 @@
           </mc:Choice>
           <mc:Fallback>
             <w:pict>
-              <v:shape id="_x0000_s1026" o:spid="_x0000_s1026" o:spt="202" type="#_x0000_t202" style="position:absolute;left:0pt;margin-left:152.8pt;margin-top:3.2pt;height:23.55pt;width:89.55pt;z-index:251672576;mso-width-relative:page;mso-height-relative:page;" fillcolor="#FFFFFF [3201]" filled="t" stroked="t" coordsize="21600,21600" o:gfxdata="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">
+              <v:shape id="_x0000_s1026" o:spid="_x0000_s1026" o:spt="202" type="#_x0000_t202" style="position:absolute;left:0pt;margin-left:152.8pt;margin-top:3.2pt;height:23.55pt;width:89.55pt;z-index:251670528;mso-width-relative:page;mso-height-relative:page;" fillcolor="#FFFFFF [3201]" filled="t" stroked="t" coordsize="21600,21600" o:gfxdata="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">
                 <v:fill on="t" focussize="0,0"/>
                 <v:stroke weight="0.5pt" color="#FFFFFF [3212]" joinstyle="round"/>
                 <v:imagedata o:title=""/>
@@ -6622,11 +6818,11 @@
         </w:rPr>
         <w:br w:type="page"/>
       </w:r>
-      <w:bookmarkStart w:id="21" w:name="_Toc19223"/>
+      <w:bookmarkStart w:id="23" w:name="_Toc14060"/>
       <w:r>
         <w:t>REFERÊNCIAS</w:t>
       </w:r>
-      <w:bookmarkEnd w:id="21"/>
+      <w:bookmarkEnd w:id="23"/>
     </w:p>
     <w:p>
       <w:pPr>

</xml_diff>